<commit_message>
recursos por nível: fórmulas, calculadora com nível, quadros e Progressão
</commit_message>
<xml_diff>
--- a/sistema_vampiro_completo.docx
+++ b/sistema_vampiro_completo.docx
@@ -559,7 +559,7 @@
         <w:spacing w:after="150"/>
       </w:pPr>
       <w:r>
-        <w:t xml:space="preserve">Vida = Vitalidade × 5 (+ bônus de Vida da classe)</w:t>
+        <w:t>Vida = Vitalidade × 5 (a cada nível)</w:t>
       </w:r>
     </w:p>
     <w:p>
@@ -567,7 +567,7 @@
         <w:spacing w:after="150"/>
       </w:pPr>
       <w:r>
-        <w:t xml:space="preserve">Sanidade = Vontade × 5 (+ bônus de Sanidade da classe)</w:t>
+        <w:t>Sanidade = Vontade × 5 (a cada nível)</w:t>
       </w:r>
     </w:p>
     <w:p>
@@ -575,7 +575,7 @@
         <w:spacing w:after="150"/>
       </w:pPr>
       <w:r>
-        <w:t xml:space="preserve">Mana = (Alma + Vontade) × 3 (+ bônus de Mana da classe)</w:t>
+        <w:t>Mana = (Alma + Vontade) × 3 (a cada nível)</w:t>
       </w:r>
     </w:p>
     <w:p>
@@ -583,7 +583,31 @@
         <w:spacing w:after="150"/>
       </w:pPr>
       <w:r>
-        <w:t xml:space="preserve">Estamina = (Força + Vitalidade) × 3 (+ bônus de Estamina da classe)</w:t>
+        <w:t>Estamina = (Força + Vitalidade) × 3 (a cada nível)</w:t>
+      </w:r>
+    </w:p>
+    <w:p>
+      <w:pPr>
+        <w:spacing w:after="150"/>
+      </w:pPr>
+      <w:r>
+        <w:t xml:space="preserve">A cada nível, o personagem soma de novo o valor de cada recurso, calculado com os atributos que ele tinha naquele nível. O bônus da classe entra uma vez só, depois de somar todos os níveis.</w:t>
+      </w:r>
+    </w:p>
+    <w:p>
+      <w:pPr>
+        <w:spacing w:after="150"/>
+      </w:pPr>
+      <w:r>
+        <w:t xml:space="preserve">No nível 1 a conta vale uma vez, e cada nível novo soma outra vez. O nível em que o personagem está sempre usa os atributos atuais; quando ele sobe, o nível que ficou pra trás guarda os atributos daquele momento, e um aumento de atributo só vale daí pra frente. Por isso a Vida e os outros recursos crescem muito conforme os atributos do personagem.</w:t>
+      </w:r>
+    </w:p>
+    <w:p>
+      <w:pPr>
+        <w:spacing w:after="150"/>
+      </w:pPr>
+      <w:r>
+        <w:t xml:space="preserve">Exemplo com Caçador (bônus de Vida 35): Vitalidade 3 nos níveis 1 a 3 e 4 a partir do nível 4. A Vida fica 80 no nível 3, 100 no nível 4 e 120 no nível 5.</w:t>
       </w:r>
     </w:p>
     <w:p>
@@ -651,7 +675,7 @@
                 <w:b/>
                 <w:bCs/>
               </w:rPr>
-              <w:t xml:space="preserve">Cada ponto dá</w:t>
+              <w:t>Cada ponto dá, a cada nível</w:t>
             </w:r>
           </w:p>
         </w:tc>
@@ -774,7 +798,7 @@
         <w:spacing w:after="150" w:before="120"/>
       </w:pPr>
       <w:r>
-        <w:t xml:space="preserve">Destreza e Razão não entram nas contas de recursos.</w:t>
+        <w:t>Destreza e Razão não entram nas contas de recursos. Um ponto colocado num atributo rende esse valor em cada nível dali pra frente.</w:t>
       </w:r>
     </w:p>
     <w:p>
@@ -783,7 +807,7 @@
         <w:spacing w:after="150" w:before="300"/>
       </w:pPr>
       <w:r>
-        <w:t xml:space="preserve">Ajustando a Vida ao subir de nível</w:t>
+        <w:t>Recursos ao subir de nível</w:t>
       </w:r>
     </w:p>
     <w:p>
@@ -791,7 +815,7 @@
         <w:spacing w:after="150"/>
       </w:pPr>
       <w:r>
-        <w:t xml:space="preserve">O jogador distribui os pontos de atributo que ganhou e recalcula os recursos. Cada ponto que vai pra Vitalidade soma +5 na Vida e +3 na Estamina; o nível em si não dá Vida.</w:t>
+        <w:t>Quando o personagem sobe de nível, o nível novo soma Vida, Sanidade, Mana e Estamina calculados com os atributos que ele tem naquele momento. Por isso vale distribuir os pontos de atributo logo depois de subir: eles já entram na conta do nível atual. Os níveis que ficaram pra trás não mudam.</w:t>
       </w:r>
     </w:p>
     <w:p>
@@ -799,7 +823,7 @@
         <w:spacing w:after="150"/>
       </w:pPr>
       <w:r>
-        <w:t xml:space="preserve">O bot de Discord faz o mesmo cálculo de duas formas: o /calcular_recursos serve pra simular com os números que o jogador digitar, e o /minha_ficha já mostra Vida, Sanidade, Mana e Estamina reais do personagem, recalculados sozinhos quando ele aumenta um atributo.</w:t>
+        <w:t>O bot de Discord faz a conta exata: o /minha_ficha mostra Vida, Sanidade, Mana e Estamina reais, somando cada nível com os atributos que o personagem tinha nele, e o /calcular_recursos simula com os números e o nível que o jogador digitar (com o mesmo atributo em todos os níveis).</w:t>
       </w:r>
     </w:p>
     <w:p>
@@ -5554,7 +5578,7 @@
         <w:spacing w:after="150"/>
       </w:pPr>
       <w:r>
-        <w:t xml:space="preserve">O nível não dá Vida direto: a Vida sobe quando os pontos de atributo vão pra Vitalidade (cada ponto vale +5 Vida e +3 Estamina).</w:t>
+        <w:t>A cada nível o personagem soma de novo Vida, Sanidade, Mana e Estamina, calculados com os atributos que tinha naquele nível (ver Recursos). Por isso os pontos de atributo pesam bastante nos recursos.</w:t>
       </w:r>
     </w:p>
     <w:p>
@@ -5605,7 +5629,7 @@
         <w:spacing w:after="150"/>
       </w:pPr>
       <w:r>
-        <w:t xml:space="preserve">O jogador distribui os pontos com /atributos (só preenche o que quer mudar) e só pode aumentar; pra diminuir, precisa de um mestre. O bot confere duas coisas: o total de pontos (6 na criação mais 1 a cada 2 níveis) e os limites de criação da raça (Humano: 3 em Força, Destreza e Vitalidade e 6 em Razão; Vampiro: 5 em Força, Destreza e Vitalidade; Vontade e Alma sem limite). Só os pontos que vêm de nível podem passar dos limites de criação, como explica o capítulo Progressão de Personagem. Pro Dhampir, como os limites ainda não foram definidos, o bot só confere o total. O jogador precisa ter sorteado a raça antes. Os mestres podem definir atributos na mão, sem essas conferências.</w:t>
+        <w:t>O jogador distribui os pontos com /atributos (só preenche o que quer mudar) e só pode aumentar; pra diminuir, precisa de um mestre. O bot confere duas coisas: o total de pontos (6 na criação mais 1 a cada 2 níveis) e os limites de criação da raça (Humano: 3 em Força, Destreza e Vitalidade e 6 em Razão; Vampiro: 5 em Força, Destreza e Vitalidade; Vontade e Alma sem limite). Só os pontos que vêm de nível podem passar dos limites de criação, como explica o capítulo Progressão de Personagem. Pro Dhampir, como os limites ainda não foram definidos, o bot só confere o total. O jogador precisa ter sorteado a raça antes. Os mestres podem definir atributos na mão, sem essas conferências. Os atributos de cada nível ficam guardados pra conta dos recursos (ver Recursos).</w:t>
       </w:r>
     </w:p>
     <w:p>
@@ -6046,7 +6070,7 @@
               <w:spacing w:after="0"/>
             </w:pPr>
             <w:r>
-              <w:t xml:space="preserve">Simula Vida, Sanidade, Mana e Estamina com os números que o jogador digitar e mostra a conta</w:t>
+              <w:t>Simula Vida, Sanidade, Mana e Estamina com os números e o nível que o jogador digitar e mostra a conta</w:t>
             </w:r>
           </w:p>
         </w:tc>

</xml_diff>

<commit_message>
docx: disciplinas, magia inicial, Combate, Dhampir, Ocultismo e Em Aberto
</commit_message>
<xml_diff>
--- a/sistema_vampiro_completo.docx
+++ b/sistema_vampiro_completo.docx
@@ -1212,7 +1212,7 @@
           <w:i/>
           <w:iCs/>
         </w:rPr>
-        <w:t xml:space="preserve">Restrita a bruxos, feiticeiros, caçadores de vampiros e vampiros.</w:t>
+        <w:t>Qualquer personagem pode usar.</w:t>
       </w:r>
     </w:p>
     <w:p>
@@ -1354,7 +1354,7 @@
         <w:spacing w:after="150"/>
       </w:pPr>
       <w:r>
-        <w:t>Poderes sobrenaturais exclusivos de vampiros e dhampirs, o equivalente a uma característica “genética” da condição vampírica. Uma Disciplina não é testada sozinha: não existe “teste de Disciplina”. Ela é uma capacidade nata, sempre presente, que faz duas coisas: destrava o que o vampiro consegue fazer (Grau 0 = não tem o poder) e dá bônus nos testes ligados a ela (+1 por grau, mais vantagem: rola dois dados e fica com o melhor).</w:t>
+        <w:t>Poderes sobrenaturais exclusivos de vampiros e dhampirs, o equivalente a uma característica “genética” da condição vampírica. Uma Disciplina não é testada sozinha: não existe “teste de Disciplina”. Ela é uma capacidade nata, sempre presente, que destrava o que o vampiro consegue fazer (Grau 0 = não tem o poder). Cada grau traz os efeitos listados abaixo. Quando o efeito dá vantagem, o jogador rola dois dados e fica com o melhor.</w:t>
       </w:r>
     </w:p>
     <w:p>
@@ -1362,7 +1362,7 @@
         <w:spacing w:after="150"/>
       </w:pPr>
       <w:r>
-        <w:t>Na criação da ficha, o vampiro recebe 4 pontos para distribuir entre as Disciplinas (1 ponto = 1 grau), e o dhampir recebe 3. O grau máximo permitido na criação é 3. Os graus 4 e 5 só são conquistados depois, durante o jogo.</w:t>
+        <w:t>Na criação da ficha, o vampiro recebe 4 pontos para distribuir entre as Disciplinas (1 ponto = 1 grau), e o dhampir recebe 3 e pode usar as dez. O grau máximo permitido na criação é 3. Os graus 4 e 5 de todas as Disciplinas estão em aberto: só entram quando alguém desbloquear em jogo, a critério do mestre.</w:t>
       </w:r>
     </w:p>
     <w:p>
@@ -1397,7 +1397,7 @@
         <w:spacing w:after="40"/>
       </w:pPr>
       <w:r>
-        <w:t xml:space="preserve">Força sobrenatural bruta.</w:t>
+        <w:t>Força sobrenatural bruta.</w:t>
       </w:r>
     </w:p>
     <w:p>
@@ -1409,7 +1409,7 @@
           <w:i/>
           <w:iCs/>
         </w:rPr>
-        <w:t xml:space="preserve">Grau 1: dobra a força em testes físicos. Grau 2: amassa metal fino, arromba mobília e portas de madeira sem esforço. Grau 3: golpes desarmados causam dano muito maior. Grau 4: arremessa objetos pesados ou pessoas a curta distância, danifica estruturas de metal. Grau 5: arranca portas, vira carruagens, quebra correntes.</w:t>
+        <w:t>Grau 1: dobra o modificador de Força no dano das armas. Grau 2: aumenta em um dado o dano de armas corpo a corpo. Grau 3: dano desarmado vira 1d12. Graus 4 e 5: em aberto.</w:t>
       </w:r>
     </w:p>
     <w:p>
@@ -1429,7 +1429,7 @@
         <w:spacing w:after="40"/>
       </w:pPr>
       <w:r>
-        <w:t xml:space="preserve">Velocidade sobrenatural.</w:t>
+        <w:t>Velocidade sobrenatural.</w:t>
       </w:r>
     </w:p>
     <w:p>
@@ -1441,7 +1441,7 @@
           <w:i/>
           <w:iCs/>
         </w:rPr>
-        <w:t xml:space="preserve">Grau 1: reage antes de qualquer humano numa cena, vantagem em iniciativa. Grau 2: pico curto de velocidade, cruza uma sala em um instante. Grau 3: cobre distâncias absurdas em frações de segundo. Grau 4: reage a mais de um ataque no mesmo turno. Grau 5: quase impossível de acertar em combate corpo a corpo sem alguma vantagem especial.</w:t>
+        <w:t>Grau 1: reage antes de qualquer humano numa cena, vantagem em iniciativa. Grau 2: ganha uma reação extra (ver Combate). Grau 3: ganha uma ação de movimento extra. Graus 4 e 5: em aberto.</w:t>
       </w:r>
     </w:p>
     <w:p>
@@ -1461,7 +1461,7 @@
         <w:spacing w:after="40"/>
       </w:pPr>
       <w:r>
-        <w:t xml:space="preserve">Passar despercebido além da furtividade normal.</w:t>
+        <w:t>Passar despercebido.</w:t>
       </w:r>
     </w:p>
     <w:p>
@@ -1473,7 +1473,7 @@
           <w:i/>
           <w:iCs/>
         </w:rPr>
-        <w:t xml:space="preserve">Grau 1: pessoas comuns não notam sua presença enquanto parado ou em silêncio. Grau 2: anda sem ser notado por quem estiver distraído. Grau 3: se move sem ser notado mesmo à vista, se ninguém estiver com atenção direta nele. Grau 4: se esconde mesmo sob atenção direta breve, se o olhar desviar por um instante. Grau 5: some completamente de vista assim que quebra o contato visual, mesmo tendo sido observado antes.</w:t>
+        <w:t>Grau 1: vantagem em testes de Furtividade. Grau 2: consegue se esconder mesmo em lugares iluminados. Grau 3: oculta a presença por completo, com DT fixa 22 pra quem tentar percebê-lo (ou rola Furtividade normal, o que for melhor). Graus 4 e 5: em aberto.</w:t>
       </w:r>
     </w:p>
     <w:p>
@@ -1493,7 +1493,7 @@
         <w:spacing w:after="40"/>
       </w:pPr>
       <w:r>
-        <w:t xml:space="preserve">Domínio sobre a atenção e a emoção alheia.</w:t>
+        <w:t>Sua presença perante outros seres, a sua intenção contra a intenção do outro.</w:t>
       </w:r>
     </w:p>
     <w:p>
@@ -1505,7 +1505,7 @@
           <w:i/>
           <w:iCs/>
         </w:rPr>
-        <w:t xml:space="preserve">Grau 1: vantagem em Enganação e Intimidação. Grau 2: atrai a atenção de um ambiente inteiro à vontade. Grau 3: inspira medo ou fascínio instantâneo num grupo pequeno. Grau 4: sustenta o efeito por mais tempo ou afeta um grupo maior. Grau 5: paralisa alguém só de existir perto da pessoa.</w:t>
+        <w:t>Grau 1: vantagem em Enganação e Intimidação. Grau 2: consegue intimidar com DT fixa 20 (ou Intimidação normal, o que for melhor). Grau 3: ao vencer um teste de Intimidação, paralisa por 1d3 turnos quem falhou (Intimidação contra a Vontade do oponente), 1 vez por combate. Graus 4 e 5: em aberto.</w:t>
       </w:r>
     </w:p>
     <w:p>
@@ -1525,7 +1525,7 @@
         <w:spacing w:after="40"/>
       </w:pPr>
       <w:r>
-        <w:t xml:space="preserve">Controle mental direto; exige contato visual e que a vítima entenda o comando dado.</w:t>
+        <w:t>Controle mental direto; exige contato visual e que a vítima entenda o comando.</w:t>
       </w:r>
     </w:p>
     <w:p>
@@ -1537,7 +1537,7 @@
           <w:i/>
           <w:iCs/>
         </w:rPr>
-        <w:t xml:space="preserve">Grau 1: sugestões simples e curtas. Grau 2: comandos um pouco mais elaborados, efeito de curta duração. Grau 3: comandos mais elaborados, altera lembranças recentes. Grau 4: implanta compulsão que persiste sem contato visual contínuo. Grau 5: controle total e temporário sobre a vontade de alguém.</w:t>
+        <w:t>Grau 1: impõe sua vontade sobre outros seres gastando 5 de Mana (Vontade contra a Vontade do alvo). Grau 2: manipula e controla mentes de seres pequenos, como animais e ratos, à vontade. Grau 3: controla seres gastando 15 de Mana (Vontade contra a Vontade do alvo). Graus 4 e 5: em aberto.</w:t>
       </w:r>
     </w:p>
     <w:p>
@@ -1557,7 +1557,7 @@
         <w:spacing w:after="40"/>
       </w:pPr>
       <w:r>
-        <w:t xml:space="preserve">Sentidos aguçados além do humano.</w:t>
+        <w:t>Sentidos aguçados além do humano.</w:t>
       </w:r>
     </w:p>
     <w:p>
@@ -1569,7 +1569,7 @@
           <w:i/>
           <w:iCs/>
         </w:rPr>
-        <w:t xml:space="preserve">Grau 1: enxerga no escuro, ouve batimentos cardíacos, percebe mentiras óbvias. Grau 2: sente presença de seres sobrenaturais próximos, rastreia por cheiro. Grau 3: lê emoções superficiais e memórias recentes por toque. Grau 4: sente coisas a maior distância, lampejos de premonição. Grau 5: telepatia limitada, visões de eventos à distância.</w:t>
+        <w:t>Grau 1: enxerga no escuro, vantagem em testes de Percepção. Grau 2: escuta batimentos e respiração de quem está por perto, mesmo atrás de paredes, e sabe quantos seres vivos há. Grau 3: sente a presença dos seres ao seu redor, com DT fixa 22 no teste de perceber seres alheios, e distingue o estado físico de cada um: se está ferido, se o sangue está forte, entre outras coisas. Graus 4 e 5: em aberto.</w:t>
       </w:r>
     </w:p>
     <w:p>
@@ -1589,7 +1589,7 @@
         <w:spacing w:after="40"/>
       </w:pPr>
       <w:r>
-        <w:t xml:space="preserve">Transformação corporal.</w:t>
+        <w:t>Transformação corporal.</w:t>
       </w:r>
     </w:p>
     <w:p>
@@ -1601,7 +1601,7 @@
           <w:i/>
           <w:iCs/>
         </w:rPr>
-        <w:t xml:space="preserve">Grau 1: olhos brilham no escuro, garras retráteis. Grau 2: alonga membros e afia dentes, transformação parcial. Grau 3: assume forma de morcego, lobo ou névoa por um tempo. Grau 4: sustenta a forma por mais tempo, ou mescla traços de mais de uma forma. Grau 5: dissolve o próprio corpo em névoa pra escapar de qualquer prisão física.</w:t>
+        <w:t>Grau 1: consegue se comunicar com animais e dar sugestões a eles. Grau 2: se transforma em animais pequenos, como ratos e morcegos, gastando 10 de Mana. Grau 3: se transforma em animais de porte médio, como cachorros e lobos, gastando 15 de Mana. Graus 4 e 5: em aberto.</w:t>
       </w:r>
     </w:p>
     <w:p>
@@ -1621,7 +1621,7 @@
         <w:spacing w:after="40"/>
       </w:pPr>
       <w:r>
-        <w:t xml:space="preserve">Magia do próprio sangue vampírico; libera acesso à magia do tipo Vampírica.</w:t>
+        <w:t>Magia do próprio sangue; libera acesso à magia do tipo Vampírica.</w:t>
       </w:r>
     </w:p>
     <w:p>
@@ -1633,7 +1633,7 @@
           <w:i/>
           <w:iCs/>
         </w:rPr>
-        <w:t xml:space="preserve">Grau 1: molda o próprio sangue em efeitos simples (endurecer uma gota, selar um corte pequeno). Grau 2: projeta o sangue a curta distância, formando um chicote ou fio cortante temporário. Grau 3: cria vínculo temporário com outra pessoa via sangue, sentindo emoções fortes dela à distância. Grau 4: manipula o sangue de outra criatura ainda dentro do corpo dela. Grau 5: molda grandes quantidades de sangue em armas, armaduras ou forma auxiliar temporária.</w:t>
+        <w:t>Grau 1: ganha acesso à magia de sangue, podendo fazer magias ligadas a controlar sangue e coisas relacionadas. Grau 2: suas magias de sangue recebem +1 dado de efeito (dano etc.). Grau 3: manipula o próprio sangue por dentro pra mudar os órgãos de lugar e outras capacidades parecidas. Graus 4 e 5: em aberto.</w:t>
       </w:r>
     </w:p>
     <w:p>
@@ -1653,7 +1653,7 @@
         <w:spacing w:after="40"/>
       </w:pPr>
       <w:r>
-        <w:t xml:space="preserve">Talento voltado ao ato de se alimentar.</w:t>
+        <w:t>Talento voltado ao ato de se alimentar.</w:t>
       </w:r>
     </w:p>
     <w:p>
@@ -1665,7 +1665,7 @@
           <w:i/>
           <w:iCs/>
         </w:rPr>
-        <w:t xml:space="preserve">Grau 1: alimenta-se de forma limpa e eficiente, sem levantar suspeita fácil. Grau 2: recupera uma pequena quantidade de Vida ao se alimentar de uma vítima viva. Grau 3: capta fragmentos de memória ou conhecimento da vítima durante a mordida. Grau 4: rouba temporariamente parte da capacidade física da vítima. Grau 5: uma única alimentação pode curar quase por completo ou conceder um pico de poder, mas a vítima fica extremamente debilitada.</w:t>
+        <w:t>Graus 1, 2 e 3: em aberto, ainda a definir. Graus 4 e 5: em aberto.</w:t>
       </w:r>
     </w:p>
     <w:p>
@@ -1685,7 +1685,7 @@
         <w:spacing w:after="40"/>
       </w:pPr>
       <w:r>
-        <w:t xml:space="preserve">Cura acelerada e resistência do corpo vampírico.</w:t>
+        <w:t>Cura acelerada do corpo vampírico.</w:t>
       </w:r>
     </w:p>
     <w:p>
@@ -1697,7 +1697,7 @@
           <w:i/>
           <w:iCs/>
         </w:rPr>
-        <w:t xml:space="preserve">Grau 1: fecha cortes pequenos e feridas superficiais em poucos instantes. Grau 2: recupera uma quantidade pequena de Vida a cada cena, sem ação especial. Grau 3: regenera feridas graves em minutos, incluindo ossos quebrados. Grau 4: regenera mesmo sob efeito que normalmente impede a cura vampírica, se o dano não for sagrado/prata. Grau 5: reconstrói partes do corpo perdidas dado tempo suficiente.</w:t>
+        <w:t>Grau 1: recupera Vida gastando Estamina (3 de Estamina = 1 de Vida). Grau 2: recupera Vida gastando Estamina (2 de Estamina = 1 de Vida), e a capacidade regenerativa dá vantagem pra resistir a efeitos adversos. Grau 3: também usa Mana pra recuperar Vida (2 de Mana = 1 de Vida) e recupera membros depois de um tempo. Graus 4 e 5: em aberto. Limite: dano de Sol, Prata, Água Sagrada e Armas Sagradas não se regenera.</w:t>
       </w:r>
     </w:p>
     <w:p>
@@ -1723,6 +1723,23 @@
       </w:pPr>
       <w:r>
         <w:t xml:space="preserve">Teste de Conjuração = 1d20 + Atributo (Alma ou Vontade) + Perícia (Ocultismo, Ritualismo ou Fé) contra a Dificuldade da magia. Falhar ainda gasta a Mana; tirar 1 natural pode fazer a magia sair do controle.</w:t>
+      </w:r>
+    </w:p>
+    <w:p>
+      <w:pPr>
+        <w:pStyle w:val="Heading2"/>
+        <w:spacing w:after="150" w:before="300"/>
+      </w:pPr>
+      <w:r>
+        <w:t xml:space="preserve">Quem Tem Magia Inicial</w:t>
+      </w:r>
+    </w:p>
+    <w:p>
+      <w:pPr>
+        <w:spacing w:after="150"/>
+      </w:pPr>
+      <w:r>
+        <w:t xml:space="preserve">Têm magia inicial os vampiros e os dhampirs, de qualquer classe, e as classes Feiticeiros e Mestre de Forja. O Mestre de Forja também tem acesso à magia, mas sem tipo de magia próprio por enquanto: isso fica em aberto até a lore da classe ser desenvolvida.</w:t>
       </w:r>
     </w:p>
     <w:p>
@@ -2287,7 +2304,7 @@
         <w:spacing w:after="150"/>
       </w:pPr>
       <w:r>
-        <w:t xml:space="preserve">Ação de Movimento: usada pra se deslocar em cena. Também serve pra recarregar uma arma de fogo, se levantar depois de cair, ou qualquer ação rápida equivalente.</w:t>
+        <w:t>Ação de Movimento: usada pra se deslocar em cena. Também serve pra recarregar uma arma de fogo, se levantar depois de cair, ou qualquer ação rápida equivalente. A Celeridade Grau 3 dá uma ação de movimento extra (ver Disciplinas).</w:t>
       </w:r>
     </w:p>
     <w:p>
@@ -2303,7 +2320,7 @@
         <w:spacing w:after="150"/>
       </w:pPr>
       <w:r>
-        <w:t xml:space="preserve">Ação de Reação: usada pra reagir a um ataque (Defesa, Bloqueio, Esquiva ou Contra-Ataque). Só uma por turno, como descrito abaixo.</w:t>
+        <w:t>Ação de Reação: usada pra reagir a um ataque (Defesa, Bloqueio, Esquiva ou Contra-Ataque). Só uma por turno, como descrito abaixo, com a exceção da Celeridade (ver Disciplinas).</w:t>
       </w:r>
     </w:p>
     <w:p>
@@ -2338,6 +2355,21 @@
       </w:pPr>
       <w:r>
         <w:t xml:space="preserve">Ao ser atacado, o personagem pode escolher uma entre quatro reações. Cada personagem só tem uma reação por turno, então só pode escolher uma delas uma vez; se mais de uma criatura atacar no mesmo turno, ele não consegue reagir aos ataques seguintes, a menos que tenha uma habilidade ou item que conceda reações extras.</w:t>
+      </w:r>
+    </w:p>
+    <w:p>
+      <w:pPr>
+        <w:spacing w:after="150"/>
+      </w:pPr>
+      <w:r>
+        <w:rPr>
+          <w:b/>
+          <w:bCs/>
+        </w:rPr>
+        <w:t xml:space="preserve">Exceção: </w:t>
+      </w:r>
+      <w:r>
+        <w:t xml:space="preserve">a Disciplina Celeridade, no Grau 2, dá uma reação extra por turno, o que abre exceção na regra de uma reação por turno (ver Disciplinas, Celeridade).</w:t>
       </w:r>
     </w:p>
     <w:p>
@@ -3955,7 +3987,7 @@
         <w:spacing w:after="120"/>
       </w:pPr>
       <w:r>
-        <w:t xml:space="preserve">Mata de forma definitiva, sem chance de Regeneração mesmo em Grau 5. É basicamente a única forma totalmente garantida de matar um vampiro para sempre.</w:t>
+        <w:t>Mata de forma definitiva, sem chance de Regeneração em qualquer grau. É basicamente a única forma totalmente garantida de matar um vampiro para sempre.</w:t>
       </w:r>
     </w:p>
     <w:p>
@@ -4032,7 +4064,7 @@
         <w:spacing w:after="120"/>
       </w:pPr>
       <w:r>
-        <w:t xml:space="preserve">Começa com 3 pontos pra distribuir (o vampiro começa com 4). Com 3 pontos, o máximo possível na criação é o grau 3. Depois disso ganha pontos de Disciplina na mesma quantidade que o vampiro (ver Disciplinas).</w:t>
+        <w:t>Começa com 3 pontos pra distribuir (o vampiro começa com 4) e pode usar as dez Disciplinas, como o vampiro. Com 3 pontos, o máximo possível na criação é o grau 3. Depois disso ganha pontos de Disciplina na mesma quantidade que o vampiro (ver Disciplinas).</w:t>
       </w:r>
     </w:p>
     <w:p>
@@ -4830,7 +4862,7 @@
         <w:spacing w:after="120"/>
       </w:pPr>
       <w:r>
-        <w:t xml:space="preserve">Exclusiva de classes mágicas. O personagem recebe uma magia inicial já na criação, com o Rank sorteado em 1d100 (ver capítulo Sistema de Magia).</w:t>
+        <w:t>Exclusiva de vampiros e dhampirs (de qualquer classe) e das classes Feiticeiros e Mestre de Forja. O personagem recebe uma magia inicial já na criação, com o Rank sorteado em 1d100 (ver capítulo Sistema de Magia).</w:t>
       </w:r>
     </w:p>
     <w:p>
@@ -6633,6 +6665,45 @@
       </w:pPr>
       <w:r>
         <w:t xml:space="preserve">As Disciplinas vampíricas (grau 0 a 5) ainda não aparecem na ficha do bot</w:t>
+      </w:r>
+    </w:p>
+    <w:p>
+      <w:pPr>
+        <w:pStyle w:val="ListParagraph"/>
+        <w:numPr>
+          <w:ilvl w:val="0"/>
+          <w:numId w:val="1"/>
+        </w:numPr>
+        <w:spacing w:after="80"/>
+      </w:pPr>
+      <w:r>
+        <w:t>Sanguessugia: os graus 1, 2 e 3 ainda estão por definir</w:t>
+      </w:r>
+    </w:p>
+    <w:p>
+      <w:pPr>
+        <w:pStyle w:val="ListParagraph"/>
+        <w:numPr>
+          <w:ilvl w:val="0"/>
+          <w:numId w:val="1"/>
+        </w:numPr>
+        <w:spacing w:after="80"/>
+      </w:pPr>
+      <w:r>
+        <w:t>Os graus 4 e 5 de todas as Disciplinas</w:t>
+      </w:r>
+    </w:p>
+    <w:p>
+      <w:pPr>
+        <w:pStyle w:val="ListParagraph"/>
+        <w:numPr>
+          <w:ilvl w:val="0"/>
+          <w:numId w:val="1"/>
+        </w:numPr>
+        <w:spacing w:after="80"/>
+      </w:pPr>
+      <w:r>
+        <w:t>O tipo de magia do Mestre de Forja</w:t>
       </w:r>
     </w:p>
     <w:sectPr>

</xml_diff>

<commit_message>
docx: texto de Humano e Vampiro e profissões por Estado
</commit_message>
<xml_diff>
--- a/sistema_vampiro_completo.docx
+++ b/sistema_vampiro_completo.docx
@@ -3849,6 +3849,14 @@
         <w:spacing w:after="150"/>
       </w:pPr>
       <w:r>
+        <w:t xml:space="preserve">São seres mundanos, sujeitos ao envelhecimento e à morte. Contudo, não se engane: suas vidas podem ser efêmeras, porém, enquanto caminham sobre a terra ou até mesmo após o tempo ter apagado seu rastro, seus fantasmas e seus significados ainda podem assombrar seres eternos para sempre. De fato, são criaturas extraordinárias com a capacidade de ter fé e, ao mesmo tempo, serem corrompidas pelos seus desejos mais obscuros.</w:t>
+      </w:r>
+    </w:p>
+    <w:p>
+      <w:pPr>
+        <w:spacing w:after="150"/>
+      </w:pPr>
+      <w:r>
         <w:t xml:space="preserve">Não tem Disciplinas. Limites de atributo na criação: Força, Destreza e Vitalidade até 3, Razão até 6. Vontade e Alma sem limite.</w:t>
       </w:r>
     </w:p>
@@ -3859,6 +3867,14 @@
       </w:pPr>
       <w:r>
         <w:t xml:space="preserve">Vampiro</w:t>
+      </w:r>
+    </w:p>
+    <w:p>
+      <w:pPr>
+        <w:spacing w:after="150"/>
+      </w:pPr>
+      <w:r>
+        <w:t>Essas criaturas estiveram na terra por anos, se escondendo, presentes em cada momento da história. O primeiro vampiro de que temos conhecimento é o Conde Drácula, ou Vlad, e precisa ser derrotado a cada 100 anos. Quando você é transformado num vampiro, apesar das vantagens como imortalidade, poderes mágicos ou feitiçaria e status sobre-humanos, existem as fraquezas: coisas como água benta, sol e decapitação, além da sede incessante por sangue. Então não se afunde muito nas suas vitórias: aqueles que fazem isso são os primeiros a morrer.</w:t>
       </w:r>
     </w:p>
     <w:p>
@@ -4513,6 +4529,75 @@
       </w:pPr>
       <w:r>
         <w:t xml:space="preserve">A Magia Divina é exclusiva de clero e nobreza com Fé suficiente (ver Sistema de Magia). As vantagens e restrições de cada Estado, e de Alto e Baixo Clero, ainda não foram definidas (ver Em Aberto).</w:t>
+      </w:r>
+    </w:p>
+    <w:p>
+      <w:pPr>
+        <w:pStyle w:val="Heading2"/>
+        <w:spacing w:after="150" w:before="300"/>
+      </w:pPr>
+      <w:r>
+        <w:t xml:space="preserve">Profissões por Estado</w:t>
+      </w:r>
+    </w:p>
+    <w:p>
+      <w:pPr>
+        <w:spacing w:after="60" w:before="150"/>
+      </w:pPr>
+      <w:r>
+        <w:rPr>
+          <w:b/>
+          <w:bCs/>
+        </w:rPr>
+        <w:t xml:space="preserve">3º Estado (Povo)</w:t>
+      </w:r>
+    </w:p>
+    <w:p>
+      <w:pPr>
+        <w:spacing w:after="150"/>
+      </w:pPr>
+      <w:r>
+        <w:t xml:space="preserve">Padeiro, Alfaiate, Sapateiro, Agricultor, Ferreiro, Costureira, Marceneiro, Pastor, Comerciante, Hospedeiro (donos de hotéis), Meretriz, Criado Doméstico (trabalham servindo aos burgueses ou à nobreza), Soldado.</w:t>
+      </w:r>
+    </w:p>
+    <w:p>
+      <w:pPr>
+        <w:spacing w:after="60" w:before="150"/>
+      </w:pPr>
+      <w:r>
+        <w:rPr>
+          <w:b/>
+          <w:bCs/>
+        </w:rPr>
+        <w:t xml:space="preserve">2º Estado (Nobreza)</w:t>
+      </w:r>
+    </w:p>
+    <w:p>
+      <w:pPr>
+        <w:spacing w:after="150"/>
+      </w:pPr>
+      <w:r>
+        <w:t xml:space="preserve">Chefe militar, Diplomata, Conselheiro real, Ministro, Juiz, Guarda real, Dama de Companhia, Coronel, Administrador Regional, Conselheiro Jurídico.</w:t>
+      </w:r>
+    </w:p>
+    <w:p>
+      <w:pPr>
+        <w:spacing w:after="60" w:before="150"/>
+      </w:pPr>
+      <w:r>
+        <w:rPr>
+          <w:b/>
+          <w:bCs/>
+        </w:rPr>
+        <w:t xml:space="preserve">1º Estado (Clero)</w:t>
+      </w:r>
+    </w:p>
+    <w:p>
+      <w:pPr>
+        <w:spacing w:after="150"/>
+      </w:pPr>
+      <w:r>
+        <w:t xml:space="preserve">Arcebispo, Bispo, Abade, Cardeal, Clérigo, Padre, Monge, Freira.</w:t>
       </w:r>
     </w:p>
     <w:p>

</xml_diff>

<commit_message>
docx: Clérigo e Mercenário, habilidades de classe com custo, Forja de Almas, textos de Vampiros e Dhampir
</commit_message>
<xml_diff>
--- a/sistema_vampiro_completo.docx
+++ b/sistema_vampiro_completo.docx
@@ -1739,7 +1739,7 @@
         <w:spacing w:after="150"/>
       </w:pPr>
       <w:r>
-        <w:t xml:space="preserve">Têm magia inicial os vampiros e os dhampirs, de qualquer classe, e as classes Feiticeiros e Mestre de Forja. O Mestre de Forja também tem acesso à magia, mas sem tipo de magia próprio por enquanto: isso fica em aberto até a lore da classe ser desenvolvida.</w:t>
+        <w:t>Têm magia inicial os vampiros e os dhampirs, de qualquer classe, e as classes Feiticeiros e Mestre de Forja. O Mestre de Forja também tem acesso à magia, com um tipo próprio: a Forja de Almas (rascunho, ver Tipos de Magia).</w:t>
       </w:r>
     </w:p>
     <w:p>
@@ -2188,6 +2188,26 @@
       </w:pPr>
       <w:r>
         <w:t xml:space="preserve">Magia da alma: prender, drenar, transferir ou proteger almas. Vem dos feiticeiros e também dos vampiros. Mais difícil de aprender e mais diversificada que as outras. Magias novas criadas nesse tipo passam por análise rígida do mestre e, na maioria das vezes, são recusadas.</w:t>
+      </w:r>
+    </w:p>
+    <w:p>
+      <w:pPr>
+        <w:spacing w:after="60" w:before="150"/>
+      </w:pPr>
+      <w:r>
+        <w:rPr>
+          <w:b/>
+          <w:bCs/>
+        </w:rPr>
+        <w:t xml:space="preserve">Forja de Almas (rascunho)</w:t>
+      </w:r>
+    </w:p>
+    <w:p>
+      <w:pPr>
+        <w:spacing w:after="150"/>
+      </w:pPr>
+      <w:r>
+        <w:t xml:space="preserve">Magia do Mestre de Forja: prende a alma de um ser e a molda em matéria, num corpo sem vida, que vira criatura da noite, ou num objeto, que vira arma, ferramenta ou peça. Exclusiva do Mestre de Forja. Diferente da Anímica, que mexe na alma como ela é, a Forja de Almas a transforma em coisa.</w:t>
       </w:r>
     </w:p>
     <w:p>
@@ -3882,6 +3902,22 @@
         <w:spacing w:after="150"/>
       </w:pPr>
       <w:r>
+        <w:t xml:space="preserve">Depois do Grande Expurgo, os vampiros aprenderam a ser esquecidos. Três séculos de silêncio fizeram deles lenda, e a lenda é o melhor esconderijo que existe: ninguém procura o que jura estar extinto. Mas o sangue continua sendo sangue, e a fome não pede licença a nenhuma revolução. Numa França onde cabeças rolam e a fé se apaga, mais um corpo sem sangue é só mais uma tragédia entre tantas.</w:t>
+      </w:r>
+    </w:p>
+    <w:p>
+      <w:pPr>
+        <w:spacing w:after="150"/>
+      </w:pPr>
+      <w:r>
+        <w:t xml:space="preserve">Ser vampiro é herdar poder e maldição no mesmo gole. As Disciplinas moldam o corpo, a mente e o sangue além do humano, e a imortalidade dá tempo de sobra pra dominá-las. Em troca, o sol é sentença, a fome enlouquece, a prata e a água benta queimam, e uma estaca ou uma lâmina no pescoço acabam com o que os séculos não acabaram. Quem esquece disso não dura.</w:t>
+      </w:r>
+    </w:p>
+    <w:p>
+      <w:pPr>
+        <w:spacing w:after="150"/>
+      </w:pPr>
+      <w:r>
         <w:t xml:space="preserve">Limites de atributo: Força, Destreza e Vitalidade até 5 (contra 3 do humano). Razão, Vontade e Alma seguem sem limite definido.</w:t>
       </w:r>
     </w:p>
@@ -4053,6 +4089,14 @@
       </w:pPr>
       <w:r>
         <w:t xml:space="preserve">Dhampir</w:t>
+      </w:r>
+    </w:p>
+    <w:p>
+      <w:pPr>
+        <w:spacing w:after="150"/>
+      </w:pPr>
+      <w:r>
+        <w:t xml:space="preserve">Nascem do vínculo entre dois mundos que quase nunca se tocam: o dos seres sujeitos à morte e ao envelhecimento, cuja vida é tão efêmera que o tempo apaga seu rastro da terra, e o das criaturas que permanecem por anos e continuam vagando por ela. Os dois têm tantas fraquezas e tantas coisas em comum que, quando se unem, quando a noite e o dia se encontram num eclipse, esses seres nascem. Os dhampirs não pertencem por inteiro a nenhum dos lados: carregam a fé e a fragilidade dos humanos e um pouco da sede e do poder dos vampiros.</w:t>
       </w:r>
     </w:p>
     <w:p>
@@ -4611,6 +4655,29 @@
     </w:p>
     <w:p>
       <w:pPr>
+        <w:spacing w:after="150"/>
+      </w:pPr>
+      <w:r>
+        <w:t xml:space="preserve">Oito classes, cada uma com bônus de recursos, vantagem em duas perícias e uma habilidade inicial. As classes descrevem o que o personagem faz, não quem ele é: um ferreiro, um juiz e uma freira podem ser Sábios; um camponês e um nobre podem ser Mercenários. Escolha a classe que combina com o que você quer jogar e conte a sua origem pela Classe Social.</w:t>
+      </w:r>
+    </w:p>
+    <w:p>
+      <w:pPr>
+        <w:spacing w:after="150"/>
+      </w:pPr>
+      <w:r>
+        <w:rPr>
+          <w:b/>
+          <w:bCs/>
+        </w:rPr>
+        <w:t xml:space="preserve">Habilidades de classe (rascunho em revisão). </w:t>
+      </w:r>
+      <w:r>
+        <w:t xml:space="preserve">Os textos, as Dificuldades e os números das habilidades abaixo ainda vão mudar. Nenhuma tem limite de usos por cena ou por turno: toda habilidade ativa gasta Estamina (as físicas e sociais) ou Mana (as de fé, saber e ritual), e o jogador usa quantas vezes o recurso aguentar. Quando a classe oferece duas habilidades, o jogador leva uma.</w:t>
+      </w:r>
+    </w:p>
+    <w:p>
+      <w:pPr>
         <w:spacing w:after="60" w:before="200"/>
       </w:pPr>
       <w:r>
@@ -4655,134 +4722,220 @@
     </w:p>
     <w:p>
       <w:pPr>
-        <w:spacing w:after="60" w:before="200"/>
-      </w:pPr>
-      <w:r>
-        <w:rPr>
-          <w:b/>
-          <w:bCs/>
-        </w:rPr>
-        <w:t xml:space="preserve">Feiticeiros</w:t>
-      </w:r>
-    </w:p>
-    <w:p>
-      <w:pPr>
-        <w:spacing w:after="60"/>
-      </w:pPr>
-      <w:r>
-        <w:t xml:space="preserve">Estudiosos do proibido, buscam nas páginas antigas e nos rituais esquecidos um poder que a maioria teme sequer nomear. Cada segredo aprendido cobra um preço, e nem todo feiticeiro percebe o quanto já pagou até ser tarde demais.</w:t>
-      </w:r>
-    </w:p>
-    <w:p>
-      <w:pPr>
-        <w:spacing w:after="40"/>
+        <w:spacing w:after="60" w:before="150"/>
+      </w:pPr>
+      <w:r>
+        <w:rPr>
+          <w:b/>
+          <w:bCs/>
+        </w:rPr>
+        <w:t xml:space="preserve">Sem Dúvidas (Inicial, Passiva, Físico) | Custo: 10 Estamina no Efeito²</w:t>
+      </w:r>
+    </w:p>
+    <w:p>
+      <w:pPr>
+        <w:spacing w:after="100"/>
       </w:pPr>
       <w:r>
         <w:rPr>
           <w:i/>
           <w:iCs/>
         </w:rPr>
-        <w:t xml:space="preserve">Vida 20 | Sanidade 20 | Mana 25 | Estamina 5</w:t>
-      </w:r>
-    </w:p>
-    <w:p>
-      <w:pPr>
-        <w:spacing w:after="120"/>
+        <w:t xml:space="preserve">Antes de iniciar uma caçada, o caçador precisa saber separar o que é mundano do que é profano: o que é obra do homem e da natureza e o que vem de bruxos e demônios. Uma vez confirmada a presença das trevas, a investigação começa.</w:t>
+      </w:r>
+    </w:p>
+    <w:p>
+      <w:pPr>
+        <w:spacing w:after="100"/>
+      </w:pPr>
+      <w:r>
+        <w:rPr>
+          <w:b/>
+          <w:bCs/>
+        </w:rPr>
+        <w:t xml:space="preserve">Efeito¹: </w:t>
+      </w:r>
+      <w:r>
+        <w:t xml:space="preserve">Ao iniciar uma cena de investigação, recebe vantagem para descobrir se algo é profano ou não natural. Não gasta nada.</w:t>
+      </w:r>
+    </w:p>
+    <w:p>
+      <w:pPr>
+        <w:spacing w:after="100"/>
+      </w:pPr>
+      <w:r>
+        <w:rPr>
+          <w:b/>
+          <w:bCs/>
+        </w:rPr>
+        <w:t xml:space="preserve">Efeito² (Presa Marcada): </w:t>
+      </w:r>
+      <w:r>
+        <w:t xml:space="preserve">Ao confirmar que um alvo é sobrenatural, o caçador o marca, gastando 10 de Estamina. Tem vantagem nos ataques e em Percepção contra ele até o fim da cena, e só mantém uma marca por vez.</w:t>
+      </w:r>
+    </w:p>
+    <w:p>
+      <w:pPr>
+        <w:spacing w:after="60" w:before="200"/>
+      </w:pPr>
+      <w:r>
+        <w:rPr>
+          <w:b/>
+          <w:bCs/>
+        </w:rPr>
+        <w:t xml:space="preserve">Clérigo</w:t>
+      </w:r>
+    </w:p>
+    <w:p>
+      <w:pPr>
+        <w:spacing w:after="60"/>
+      </w:pPr>
+      <w:r>
+        <w:t xml:space="preserve">Cuidam do corpo e da alma de quem chega até eles. Servem à fé, ou ao que sobrou dela, num tempo em que a própria Igreja se divide: com a mão sobre o ferido e a palavra sobre o moribundo, são o último abrigo de quem já não sabe em quem confiar. Não precisam vestir batina: cura quem sabe curar.</w:t>
+      </w:r>
+    </w:p>
+    <w:p>
+      <w:pPr>
+        <w:spacing w:after="40"/>
       </w:pPr>
       <w:r>
         <w:rPr>
           <w:i/>
           <w:iCs/>
         </w:rPr>
-        <w:t xml:space="preserve">Vantagens nas Perícias: Investigação e Ocultismo.</w:t>
-      </w:r>
-    </w:p>
-    <w:p>
-      <w:pPr>
-        <w:spacing w:after="60" w:before="200"/>
-      </w:pPr>
-      <w:r>
-        <w:rPr>
-          <w:b/>
-          <w:bCs/>
-        </w:rPr>
-        <w:t xml:space="preserve">Ladrão</w:t>
-      </w:r>
-    </w:p>
-    <w:p>
-      <w:pPr>
-        <w:spacing w:after="60"/>
-      </w:pPr>
-      <w:r>
-        <w:t xml:space="preserve">Sobrevive pela lâmina afiada da língua e pela sombra que nunca o larga. Não busca glória nem verdade. Busca o próximo passo, a próxima porta trancada, a próxima chance de sumir antes que alguém perceba que ele esteve ali.</w:t>
-      </w:r>
-    </w:p>
-    <w:p>
-      <w:pPr>
-        <w:spacing w:after="40"/>
+        <w:t xml:space="preserve">Vida 20 | Sanidade 30 | Mana 15 | Estamina 10</w:t>
+      </w:r>
+    </w:p>
+    <w:p>
+      <w:pPr>
+        <w:spacing w:after="120"/>
       </w:pPr>
       <w:r>
         <w:rPr>
           <w:i/>
           <w:iCs/>
         </w:rPr>
-        <w:t xml:space="preserve">Vida 25 | Sanidade 20 | Mana 10 | Estamina 15</w:t>
-      </w:r>
-    </w:p>
-    <w:p>
-      <w:pPr>
-        <w:spacing w:after="120"/>
+        <w:t xml:space="preserve">Vantagens nas Perícias: Religião e Medicina.</w:t>
+      </w:r>
+    </w:p>
+    <w:p>
+      <w:pPr>
+        <w:spacing w:after="60"/>
       </w:pPr>
       <w:r>
         <w:rPr>
           <w:i/>
           <w:iCs/>
         </w:rPr>
-        <w:t xml:space="preserve">Vantagens nas Perícias: Furtividade e Enganação.</w:t>
-      </w:r>
-    </w:p>
-    <w:p>
-      <w:pPr>
-        <w:spacing w:after="60" w:before="200"/>
-      </w:pPr>
-      <w:r>
-        <w:rPr>
-          <w:b/>
-          <w:bCs/>
-        </w:rPr>
-        <w:t xml:space="preserve">Mestre de Forja</w:t>
-      </w:r>
-    </w:p>
-    <w:p>
-      <w:pPr>
-        <w:spacing w:after="60"/>
-      </w:pPr>
-      <w:r>
-        <w:t xml:space="preserve">Funde o conhecimento das mãos com o conhecimento proibido: entende que uma lâmina comum não fere o que espreita na escuridão, e dedica a vida a forjar o que realmente pode. Cada peça que sai da sua bigorna carrega um propósito.</w:t>
-      </w:r>
-    </w:p>
-    <w:p>
-      <w:pPr>
-        <w:spacing w:after="40"/>
+        <w:t xml:space="preserve">Escolha uma das duas ao criar o personagem.</w:t>
+      </w:r>
+    </w:p>
+    <w:p>
+      <w:pPr>
+        <w:spacing w:after="60" w:before="150"/>
+      </w:pPr>
+      <w:r>
+        <w:rPr>
+          <w:b/>
+          <w:bCs/>
+        </w:rPr>
+        <w:t xml:space="preserve">Mãos que Curam (Inicial, Ativa, Fé) | Custo: 15 Mana</w:t>
+      </w:r>
+    </w:p>
+    <w:p>
+      <w:pPr>
+        <w:spacing w:after="100"/>
       </w:pPr>
       <w:r>
         <w:rPr>
           <w:i/>
           <w:iCs/>
         </w:rPr>
-        <w:t xml:space="preserve">Vida 15 | Sanidade 35 | Mana 15 | Estamina 20</w:t>
-      </w:r>
-    </w:p>
-    <w:p>
-      <w:pPr>
-        <w:spacing w:after="120"/>
+        <w:t xml:space="preserve">Onde os outros veem uma ferida, o clérigo vê alguém que ainda pode ser salvo.</w:t>
+      </w:r>
+    </w:p>
+    <w:p>
+      <w:pPr>
+        <w:spacing w:after="100"/>
+      </w:pPr>
+      <w:r>
+        <w:rPr>
+          <w:b/>
+          <w:bCs/>
+        </w:rPr>
+        <w:t xml:space="preserve">Efeito¹: </w:t>
+      </w:r>
+      <w:r>
+        <w:t xml:space="preserve">Gasta 15 de Mana e toca um aliado. Faz um teste de Fé (DT 15): se passar, o aliado recupera Vida igual a Alma × 5. Pode repetir quantas vezes a Mana aguentar.</w:t>
+      </w:r>
+    </w:p>
+    <w:p>
+      <w:pPr>
+        <w:spacing w:after="100"/>
+      </w:pPr>
+      <w:r>
+        <w:rPr>
+          <w:b/>
+          <w:bCs/>
+        </w:rPr>
+        <w:t xml:space="preserve">Efeito²: </w:t>
+      </w:r>
+      <w:r>
+        <w:t xml:space="preserve">Estabilizar quem está com a Vida em 0 custa 20 de Mana e não precisa de teste.</w:t>
+      </w:r>
+    </w:p>
+    <w:p>
+      <w:pPr>
+        <w:spacing w:after="60" w:before="150"/>
+      </w:pPr>
+      <w:r>
+        <w:rPr>
+          <w:b/>
+          <w:bCs/>
+        </w:rPr>
+        <w:t xml:space="preserve">Bênção (Inicial, Ativa, Fé) | Custo: 10 Mana</w:t>
+      </w:r>
+    </w:p>
+    <w:p>
+      <w:pPr>
+        <w:spacing w:after="100"/>
       </w:pPr>
       <w:r>
         <w:rPr>
           <w:i/>
           <w:iCs/>
         </w:rPr>
-        <w:t xml:space="preserve">Vantagens nas Perícias: Ocultismo e Tática.</w:t>
+        <w:t xml:space="preserve">Um gesto, uma palavra, e a arma passa a servir a algo maior do que quem a empunha.</w:t>
+      </w:r>
+    </w:p>
+    <w:p>
+      <w:pPr>
+        <w:spacing w:after="100"/>
+      </w:pPr>
+      <w:r>
+        <w:rPr>
+          <w:b/>
+          <w:bCs/>
+        </w:rPr>
+        <w:t xml:space="preserve">Efeito¹: </w:t>
+      </w:r>
+      <w:r>
+        <w:t xml:space="preserve">Gasta 10 de Mana e abençoa um alvo ao alcance do toque: um aliado ou o próprio clérigo (teste de Fé, DT 15). Até o fim da cena, o dano do abençoado se torna sagrado.</w:t>
+      </w:r>
+    </w:p>
+    <w:p>
+      <w:pPr>
+        <w:spacing w:after="100"/>
+      </w:pPr>
+      <w:r>
+        <w:rPr>
+          <w:b/>
+          <w:bCs/>
+        </w:rPr>
+        <w:t xml:space="preserve">Efeito²: </w:t>
+      </w:r>
+      <w:r>
+        <w:t xml:space="preserve">O dano sagrado segue a regra de Armas Sagradas (ver Fraquezas).</w:t>
       </w:r>
     </w:p>
     <w:p>
@@ -4794,7 +4947,7 @@
           <w:b/>
           <w:bCs/>
         </w:rPr>
-        <w:t xml:space="preserve">Mundano</w:t>
+        <w:t xml:space="preserve">Feiticeiros</w:t>
       </w:r>
     </w:p>
     <w:p>
@@ -4802,7 +4955,7 @@
         <w:spacing w:after="60"/>
       </w:pPr>
       <w:r>
-        <w:t xml:space="preserve">Você vive um dia de cada vez, cuidando dos seus afazeres cotidianos e se preocupando, no máximo, com o que vai comer no almoço. Sua vida segue sem muitas preocupações, até que as trevas decidam o contrário.</w:t>
+        <w:t xml:space="preserve">Estudiosos do proibido, buscam nas páginas antigas e nos rituais esquecidos um poder que a maioria teme sequer nomear. Cada segredo aprendido cobra um preço, e nem todo feiticeiro percebe o quanto já pagou até ser tarde demais.</w:t>
       </w:r>
     </w:p>
     <w:p>
@@ -4814,7 +4967,7 @@
           <w:i/>
           <w:iCs/>
         </w:rPr>
-        <w:t xml:space="preserve">Vida 10 | Sanidade 15 | Mana 10 | Estamina 10</w:t>
+        <w:t xml:space="preserve">Vida 20 | Sanidade 20 | Mana 25 | Estamina 5</w:t>
       </w:r>
     </w:p>
     <w:p>
@@ -4826,51 +4979,602 @@
           <w:i/>
           <w:iCs/>
         </w:rPr>
-        <w:t xml:space="preserve">Vantagens nas Perícias: duas à sua escolha.</w:t>
-      </w:r>
-    </w:p>
-    <w:p>
-      <w:pPr>
-        <w:spacing w:after="60" w:before="200"/>
-      </w:pPr>
-      <w:r>
-        <w:rPr>
-          <w:b/>
-          <w:bCs/>
-        </w:rPr>
-        <w:t xml:space="preserve">Sábio</w:t>
-      </w:r>
-    </w:p>
-    <w:p>
-      <w:pPr>
-        <w:spacing w:after="60"/>
-      </w:pPr>
-      <w:r>
-        <w:t xml:space="preserve">Os sábios buscam o saber que liberta da fome, do medo e da ignorância. Mas, neste mundo de trevas, quem seria capaz de encontrá-lo? Preferem a biblioteca ao campo de batalha, mas o que aprendem muitas vezes os arrasta pra lá de qualquer jeito.</w:t>
-      </w:r>
-    </w:p>
-    <w:p>
-      <w:pPr>
-        <w:spacing w:after="40"/>
+        <w:t xml:space="preserve">Vantagens nas Perícias: Investigação e Ocultismo.</w:t>
+      </w:r>
+    </w:p>
+    <w:p>
+      <w:pPr>
+        <w:spacing w:after="60" w:before="150"/>
+      </w:pPr>
+      <w:r>
+        <w:rPr>
+          <w:b/>
+          <w:bCs/>
+        </w:rPr>
+        <w:t xml:space="preserve">Dom Nato (Inicial, Passiva, Magia)</w:t>
+      </w:r>
+    </w:p>
+    <w:p>
+      <w:pPr>
+        <w:spacing w:after="100"/>
       </w:pPr>
       <w:r>
         <w:rPr>
           <w:i/>
           <w:iCs/>
         </w:rPr>
-        <w:t xml:space="preserve">Vida 15 | Sanidade 35 | Mana 20 | Estamina 5</w:t>
-      </w:r>
-    </w:p>
-    <w:p>
-      <w:pPr>
-        <w:spacing w:after="120"/>
+        <w:t xml:space="preserve">Nascidos pra criar e aprimorar o que os outros só temem, os feiticeiros dobram a mão no que já sabem fazer.</w:t>
+      </w:r>
+    </w:p>
+    <w:p>
+      <w:pPr>
+        <w:spacing w:after="100"/>
+      </w:pPr>
+      <w:r>
+        <w:rPr>
+          <w:b/>
+          <w:bCs/>
+        </w:rPr>
+        <w:t xml:space="preserve">Efeito¹: </w:t>
+      </w:r>
+      <w:r>
+        <w:t xml:space="preserve">Toda magia do feiticeiro recebe +1 dado de efeito (dano, cura etc.).</w:t>
+      </w:r>
+    </w:p>
+    <w:p>
+      <w:pPr>
+        <w:spacing w:after="100"/>
+      </w:pPr>
+      <w:r>
+        <w:rPr>
+          <w:b/>
+          <w:bCs/>
+        </w:rPr>
+        <w:t xml:space="preserve">Efeito²: </w:t>
+      </w:r>
+      <w:r>
+        <w:t xml:space="preserve">Gasta menos Mana pra lançar magias: cada magia custa Razão × 5 de Mana a menos, com custo mínimo de 1.</w:t>
+      </w:r>
+    </w:p>
+    <w:p>
+      <w:pPr>
+        <w:spacing w:after="60" w:before="200"/>
+      </w:pPr>
+      <w:r>
+        <w:rPr>
+          <w:b/>
+          <w:bCs/>
+        </w:rPr>
+        <w:t xml:space="preserve">Ladrão</w:t>
+      </w:r>
+    </w:p>
+    <w:p>
+      <w:pPr>
+        <w:spacing w:after="60"/>
+      </w:pPr>
+      <w:r>
+        <w:t xml:space="preserve">Sobrevive pela lâmina afiada da língua e pela sombra que nunca o larga. Não busca glória nem verdade. Busca o próximo passo, a próxima porta trancada, a próxima chance de sumir antes que alguém perceba que ele esteve ali.</w:t>
+      </w:r>
+    </w:p>
+    <w:p>
+      <w:pPr>
+        <w:spacing w:after="40"/>
       </w:pPr>
       <w:r>
         <w:rPr>
           <w:i/>
           <w:iCs/>
         </w:rPr>
+        <w:t xml:space="preserve">Vida 25 | Sanidade 20 | Mana 10 | Estamina 15</w:t>
+      </w:r>
+    </w:p>
+    <w:p>
+      <w:pPr>
+        <w:spacing w:after="120"/>
+      </w:pPr>
+      <w:r>
+        <w:rPr>
+          <w:i/>
+          <w:iCs/>
+        </w:rPr>
+        <w:t xml:space="preserve">Vantagens nas Perícias: Furtividade e Enganação.</w:t>
+      </w:r>
+    </w:p>
+    <w:p>
+      <w:pPr>
+        <w:spacing w:after="60"/>
+      </w:pPr>
+      <w:r>
+        <w:rPr>
+          <w:i/>
+          <w:iCs/>
+        </w:rPr>
+        <w:t xml:space="preserve">Escolha uma das duas ao criar o personagem.</w:t>
+      </w:r>
+    </w:p>
+    <w:p>
+      <w:pPr>
+        <w:spacing w:after="60" w:before="150"/>
+      </w:pPr>
+      <w:r>
+        <w:rPr>
+          <w:b/>
+          <w:bCs/>
+        </w:rPr>
+        <w:t xml:space="preserve">Mão Leve (Inicial, Ativa, Físico) | Custo: 10 Estamina</w:t>
+      </w:r>
+    </w:p>
+    <w:p>
+      <w:pPr>
+        <w:spacing w:after="100"/>
+      </w:pPr>
+      <w:r>
+        <w:rPr>
+          <w:i/>
+          <w:iCs/>
+        </w:rPr>
+        <w:t xml:space="preserve">Uma mão tão suave quanto uma pluma. O que o ladrão deseja, ele consegue, desde que ninguém o note.</w:t>
+      </w:r>
+    </w:p>
+    <w:p>
+      <w:pPr>
+        <w:spacing w:after="100"/>
+      </w:pPr>
+      <w:r>
+        <w:rPr>
+          <w:b/>
+          <w:bCs/>
+        </w:rPr>
+        <w:t xml:space="preserve">Efeito¹: </w:t>
+      </w:r>
+      <w:r>
+        <w:t xml:space="preserve">Gasta 10 de Estamina e faz um teste de Furtividade com vantagem contra a Percepção do alvo. Se passar, rouba um item pequeno ou médio do inventário dele, ou coloca um no lugar.</w:t>
+      </w:r>
+    </w:p>
+    <w:p>
+      <w:pPr>
+        <w:spacing w:after="100"/>
+      </w:pPr>
+      <w:r>
+        <w:rPr>
+          <w:b/>
+          <w:bCs/>
+        </w:rPr>
+        <w:t xml:space="preserve">Efeito²: </w:t>
+      </w:r>
+      <w:r>
+        <w:t xml:space="preserve">Cada tentativa gasta a Estamina, dê certo ou não.</w:t>
+      </w:r>
+    </w:p>
+    <w:p>
+      <w:pPr>
+        <w:spacing w:after="60" w:before="150"/>
+      </w:pPr>
+      <w:r>
+        <w:rPr>
+          <w:b/>
+          <w:bCs/>
+        </w:rPr>
+        <w:t xml:space="preserve">Língua de Prata (Inicial, Ativa, Social) | Custo: 10 Estamina</w:t>
+      </w:r>
+    </w:p>
+    <w:p>
+      <w:pPr>
+        <w:spacing w:after="100"/>
+      </w:pPr>
+      <w:r>
+        <w:rPr>
+          <w:i/>
+          <w:iCs/>
+        </w:rPr>
+        <w:t xml:space="preserve">A arma mais afiada que o ladrão carrega não tem cabo.</w:t>
+      </w:r>
+    </w:p>
+    <w:p>
+      <w:pPr>
+        <w:spacing w:after="100"/>
+      </w:pPr>
+      <w:r>
+        <w:rPr>
+          <w:b/>
+          <w:bCs/>
+        </w:rPr>
+        <w:t xml:space="preserve">Efeito¹: </w:t>
+      </w:r>
+      <w:r>
+        <w:t xml:space="preserve">Gasta 10 de Estamina e faz um teste de Enganação com vantagem pra vender uma mentira, distrair um guarda ou sair de uma conversa que ia mal.</w:t>
+      </w:r>
+    </w:p>
+    <w:p>
+      <w:pPr>
+        <w:spacing w:after="60" w:before="200"/>
+      </w:pPr>
+      <w:r>
+        <w:rPr>
+          <w:b/>
+          <w:bCs/>
+        </w:rPr>
+        <w:t xml:space="preserve">Mercenário</w:t>
+      </w:r>
+    </w:p>
+    <w:p>
+      <w:pPr>
+        <w:spacing w:after="60"/>
+      </w:pPr>
+      <w:r>
+        <w:t xml:space="preserve">Viveu a vida lutando: com a espada, com as mãos, com o corpo inteiro. Cobra pelo serviço, ou luta de graça por quem precisa, e aprendeu cedo que o mal do mundo não vem só de vampiros e demônios: os homens dão conta de sobra. Talvez nunca tenha visto o sobrenatural, mas conhece o perigo como poucos.</w:t>
+      </w:r>
+    </w:p>
+    <w:p>
+      <w:pPr>
+        <w:spacing w:after="40"/>
+      </w:pPr>
+      <w:r>
+        <w:rPr>
+          <w:i/>
+          <w:iCs/>
+        </w:rPr>
+        <w:t xml:space="preserve">Vida 30 | Sanidade 20 | Mana 5 | Estamina 20</w:t>
+      </w:r>
+    </w:p>
+    <w:p>
+      <w:pPr>
+        <w:spacing w:after="120"/>
+      </w:pPr>
+      <w:r>
+        <w:rPr>
+          <w:i/>
+          <w:iCs/>
+        </w:rPr>
+        <w:t xml:space="preserve">Vantagens nas Perícias: Tática e Luta ou Pontaria.</w:t>
+      </w:r>
+    </w:p>
+    <w:p>
+      <w:pPr>
+        <w:spacing w:after="60" w:before="150"/>
+      </w:pPr>
+      <w:r>
+        <w:rPr>
+          <w:b/>
+          <w:bCs/>
+        </w:rPr>
+        <w:t xml:space="preserve">Ombro a Ombro (Inicial, Ativa, Físico) | Custo: 10 Estamina</w:t>
+      </w:r>
+    </w:p>
+    <w:p>
+      <w:pPr>
+        <w:spacing w:after="100"/>
+      </w:pPr>
+      <w:r>
+        <w:rPr>
+          <w:i/>
+          <w:iCs/>
+        </w:rPr>
+        <w:t xml:space="preserve">Quem vive de espada sabe que o perigo mais comum tem rosto de homem, e que o corpo é o escudo mais barato que existe.</w:t>
+      </w:r>
+    </w:p>
+    <w:p>
+      <w:pPr>
+        <w:spacing w:after="100"/>
+      </w:pPr>
+      <w:r>
+        <w:rPr>
+          <w:b/>
+          <w:bCs/>
+        </w:rPr>
+        <w:t xml:space="preserve">Efeito¹: </w:t>
+      </w:r>
+      <w:r>
+        <w:t xml:space="preserve">Quando um aliado ao alcance é atacado, gasta a sua reação e 10 de Estamina pra se colocar na frente e receber o ataque no lugar dele, com vantagem no teste de defesa.</w:t>
+      </w:r>
+    </w:p>
+    <w:p>
+      <w:pPr>
+        <w:spacing w:after="60" w:before="200"/>
+      </w:pPr>
+      <w:r>
+        <w:rPr>
+          <w:b/>
+          <w:bCs/>
+        </w:rPr>
+        <w:t xml:space="preserve">Mestre de Forja</w:t>
+      </w:r>
+    </w:p>
+    <w:p>
+      <w:pPr>
+        <w:spacing w:after="60"/>
+      </w:pPr>
+      <w:r>
+        <w:t>Funde o conhecimento das mãos com o conhecimento proibido: entende que uma lâmina comum não fere o que espreita na escuridão, e que toda alma pesa, e o que pesa pode ser moldado. Na bigorna, almas viram lâmina, ferramenta e armadura; no ritual, corpos sem vida voltam como criaturas da noite, tão fiéis quanto cães a quem os forjou. Cada peça e cada criatura carrega o preço de quem foi antes.</w:t>
+      </w:r>
+    </w:p>
+    <w:p>
+      <w:pPr>
+        <w:spacing w:after="40"/>
+      </w:pPr>
+      <w:r>
+        <w:rPr>
+          <w:i/>
+          <w:iCs/>
+        </w:rPr>
+        <w:t xml:space="preserve">Vida 15 | Sanidade 35 | Mana 15 | Estamina 20</w:t>
+      </w:r>
+    </w:p>
+    <w:p>
+      <w:pPr>
+        <w:spacing w:after="120"/>
+      </w:pPr>
+      <w:r>
+        <w:rPr>
+          <w:i/>
+          <w:iCs/>
+        </w:rPr>
+        <w:t xml:space="preserve">Vantagens nas Perícias: Ocultismo e Tática.</w:t>
+      </w:r>
+    </w:p>
+    <w:p>
+      <w:pPr>
+        <w:spacing w:after="60" w:before="150"/>
+      </w:pPr>
+      <w:r>
+        <w:rPr>
+          <w:b/>
+          <w:bCs/>
+        </w:rPr>
+        <w:t xml:space="preserve">Forja de Almas (Inicial, Ativa, Ritual) | Custo: Mana por Rank</w:t>
+      </w:r>
+    </w:p>
+    <w:p>
+      <w:pPr>
+        <w:spacing w:after="100"/>
+      </w:pPr>
+      <w:r>
+        <w:rPr>
+          <w:i/>
+          <w:iCs/>
+        </w:rPr>
+        <w:t xml:space="preserve">Toda alma pesa, e o que pesa pode ser moldado.</w:t>
+      </w:r>
+    </w:p>
+    <w:p>
+      <w:pPr>
+        <w:spacing w:after="100"/>
+      </w:pPr>
+      <w:r>
+        <w:rPr>
+          <w:b/>
+          <w:bCs/>
+        </w:rPr>
+        <w:t xml:space="preserve">Efeito¹ (Catalisador): </w:t>
+      </w:r>
+      <w:r>
+        <w:t xml:space="preserve">Todo ritual pede um instrumento, que serve de catalisador: um martelo, uma faca, até uma dama de ferro. Pede também um recipiente pra alma: um corpo já morto, que vira uma criatura da noite, ou um objeto, que vira arma, ferramenta ou peça.</w:t>
+      </w:r>
+    </w:p>
+    <w:p>
+      <w:pPr>
+        <w:spacing w:after="100"/>
+      </w:pPr>
+      <w:r>
+        <w:rPr>
+          <w:b/>
+          <w:bCs/>
+        </w:rPr>
+        <w:t xml:space="preserve">Efeito² (A alma): </w:t>
+      </w:r>
+      <w:r>
+        <w:t xml:space="preserve">A alma que o mestre de forja prende decide o resultado. Quanto mais forte foi a alma em vida, mais alto o Rank da criatura ou do objeto que ela consegue sustentar. Um corpo comum rende pouco.</w:t>
+      </w:r>
+    </w:p>
+    <w:p>
+      <w:pPr>
+        <w:spacing w:after="100"/>
+      </w:pPr>
+      <w:r>
+        <w:rPr>
+          <w:b/>
+          <w:bCs/>
+        </w:rPr>
+        <w:t xml:space="preserve">Efeito³ (O preço): </w:t>
+      </w:r>
+      <w:r>
+        <w:t xml:space="preserve">O ritual gasta Mana conforme o Rank do que se quer forjar, com o custo definido pelo mestre, como nas magias. Faz um teste de Ritualismo: falhar gasta a Mana do mesmo jeito, e um 1 natural faz a alma reagir. A criatura se volta contra quem a forjou, ou o objeto sai amaldiçoado.</w:t>
+      </w:r>
+    </w:p>
+    <w:p>
+      <w:pPr>
+        <w:spacing w:after="60" w:before="200"/>
+      </w:pPr>
+      <w:r>
+        <w:rPr>
+          <w:b/>
+          <w:bCs/>
+        </w:rPr>
+        <w:t xml:space="preserve">Mundano</w:t>
+      </w:r>
+    </w:p>
+    <w:p>
+      <w:pPr>
+        <w:spacing w:after="60"/>
+      </w:pPr>
+      <w:r>
+        <w:t>Você vive um dia de cada vez, cuidando dos seus afazeres cotidianos e se preocupando, no máximo, com o que vai comer no almoço. Sua vida segue sem muitas preocupações, até que as trevas decidam o contrário. Ainda não escolheu o seu lugar no mundo, e talvez o encontre: conquistar uma classe exige RP e conversa com o mestre.</w:t>
+      </w:r>
+    </w:p>
+    <w:p>
+      <w:pPr>
+        <w:spacing w:after="40"/>
+      </w:pPr>
+      <w:r>
+        <w:rPr>
+          <w:i/>
+          <w:iCs/>
+        </w:rPr>
+        <w:t xml:space="preserve">Vida 10 | Sanidade 15 | Mana 10 | Estamina 10</w:t>
+      </w:r>
+    </w:p>
+    <w:p>
+      <w:pPr>
+        <w:spacing w:after="120"/>
+      </w:pPr>
+      <w:r>
+        <w:rPr>
+          <w:i/>
+          <w:iCs/>
+        </w:rPr>
+        <w:t xml:space="preserve">Vantagens nas Perícias: duas à sua escolha.</w:t>
+      </w:r>
+    </w:p>
+    <w:p>
+      <w:pPr>
+        <w:spacing w:after="60" w:before="150"/>
+      </w:pPr>
+      <w:r>
+        <w:rPr>
+          <w:b/>
+          <w:bCs/>
+        </w:rPr>
+        <w:t xml:space="preserve">Aprimoração (Inicial, Passiva)</w:t>
+      </w:r>
+    </w:p>
+    <w:p>
+      <w:pPr>
+        <w:spacing w:after="100"/>
+      </w:pPr>
+      <w:r>
+        <w:rPr>
+          <w:i/>
+          <w:iCs/>
+        </w:rPr>
+        <w:t xml:space="preserve">Quem vive no mundo comum ainda não escolheu o seu lugar nele. Quando as trevas chegam, algo desperta, e a rotina vira aprendizado.</w:t>
+      </w:r>
+    </w:p>
+    <w:p>
+      <w:pPr>
+        <w:spacing w:after="100"/>
+      </w:pPr>
+      <w:r>
+        <w:rPr>
+          <w:b/>
+          <w:bCs/>
+        </w:rPr>
+        <w:t xml:space="preserve">Efeito¹ (Vida vivida): </w:t>
+      </w:r>
+      <w:r>
+        <w:t xml:space="preserve">+5 pontos de perícia na criação, além dos 25 comuns (30 no total), porque o Mundano vive a vida e aprende de tudo um pouco.</w:t>
+      </w:r>
+    </w:p>
+    <w:p>
+      <w:pPr>
+        <w:spacing w:after="100"/>
+      </w:pPr>
+      <w:r>
+        <w:rPr>
+          <w:b/>
+          <w:bCs/>
+        </w:rPr>
+        <w:t xml:space="preserve">Efeito² (Aprimoração): </w:t>
+      </w:r>
+      <w:r>
+        <w:t xml:space="preserve">Durante o RP, o Mundano pode se aprimorar pra uma das classes existentes. Não é automático: só acontece por RP, em conversa com o mestre. Ao trocar, passa a ter os recursos, a vantagem de perícias e a habilidade da nova classe no lugar dos de Mundano, e os 5 pontos ficam. Se a nova classe tem magia inicial, sorteia na hora.</w:t>
+      </w:r>
+    </w:p>
+    <w:p>
+      <w:pPr>
+        <w:spacing w:after="60" w:before="200"/>
+      </w:pPr>
+      <w:r>
+        <w:rPr>
+          <w:b/>
+          <w:bCs/>
+        </w:rPr>
+        <w:t xml:space="preserve">Sábio</w:t>
+      </w:r>
+    </w:p>
+    <w:p>
+      <w:pPr>
+        <w:spacing w:after="60"/>
+      </w:pPr>
+      <w:r>
+        <w:t xml:space="preserve">Os sábios buscam o saber que liberta da fome, do medo e da ignorância. Mas, neste mundo de trevas, quem seria capaz de encontrá-lo? Preferem a biblioteca ao campo de batalha, mas o que aprendem muitas vezes os arrasta pra lá de qualquer jeito.</w:t>
+      </w:r>
+    </w:p>
+    <w:p>
+      <w:pPr>
+        <w:spacing w:after="40"/>
+      </w:pPr>
+      <w:r>
+        <w:rPr>
+          <w:i/>
+          <w:iCs/>
+        </w:rPr>
+        <w:t xml:space="preserve">Vida 15 | Sanidade 35 | Mana 20 | Estamina 5</w:t>
+      </w:r>
+    </w:p>
+    <w:p>
+      <w:pPr>
+        <w:spacing w:after="120"/>
+      </w:pPr>
+      <w:r>
+        <w:rPr>
+          <w:i/>
+          <w:iCs/>
+        </w:rPr>
         <w:t xml:space="preserve">Vantagens nas Perícias: Ciências e Investigação.</w:t>
+      </w:r>
+    </w:p>
+    <w:p>
+      <w:pPr>
+        <w:spacing w:after="60" w:before="150"/>
+      </w:pPr>
+      <w:r>
+        <w:rPr>
+          <w:b/>
+          <w:bCs/>
+        </w:rPr>
+        <w:t xml:space="preserve">Ponto Fraco (Inicial, Ativa, Saber) | Custo: 10 Mana</w:t>
+      </w:r>
+    </w:p>
+    <w:p>
+      <w:pPr>
+        <w:spacing w:after="100"/>
+      </w:pPr>
+      <w:r>
+        <w:rPr>
+          <w:i/>
+          <w:iCs/>
+        </w:rPr>
+        <w:t xml:space="preserve">Todo monstro tem uma falha, e quase sempre alguém já a escreveu num livro.</w:t>
+      </w:r>
+    </w:p>
+    <w:p>
+      <w:pPr>
+        <w:spacing w:after="100"/>
+      </w:pPr>
+      <w:r>
+        <w:rPr>
+          <w:b/>
+          <w:bCs/>
+        </w:rPr>
+        <w:t xml:space="preserve">Efeito¹: </w:t>
+      </w:r>
+      <w:r>
+        <w:t xml:space="preserve">Gasta 10 de Mana e uma ação padrão estudando um alvo que consiga observar. Faz um teste de Ciências ou Investigação (DT 15).</w:t>
+      </w:r>
+    </w:p>
+    <w:p>
+      <w:pPr>
+        <w:spacing w:after="100"/>
+      </w:pPr>
+      <w:r>
+        <w:rPr>
+          <w:b/>
+          <w:bCs/>
+        </w:rPr>
+        <w:t xml:space="preserve">Efeito²: </w:t>
+      </w:r>
+      <w:r>
+        <w:t xml:space="preserve">Se passar, descobre uma fraqueza ou resistência do alvo (o mestre revela uma). O sábio e os aliados que o ouvirem têm vantagem no próximo ataque que explorar essa fraqueza.</w:t>
       </w:r>
     </w:p>
     <w:p>
@@ -4879,7 +5583,7 @@
         <w:spacing w:after="200" w:before="400"/>
       </w:pPr>
       <w:r>
-        <w:t>14. Habilidades Iniciais</w:t>
+        <w:t>14. Habilidade Própria e Magia Inicial</w:t>
       </w:r>
     </w:p>
     <w:p>
@@ -6788,7 +7492,33 @@
         <w:spacing w:after="80"/>
       </w:pPr>
       <w:r>
-        <w:t>O tipo de magia do Mestre de Forja</w:t>
+        <w:t>Forja de Almas, o tipo de magia do Mestre de Forja (rascunho)</w:t>
+      </w:r>
+    </w:p>
+    <w:p>
+      <w:pPr>
+        <w:pStyle w:val="ListParagraph"/>
+        <w:numPr>
+          <w:ilvl w:val="0"/>
+          <w:numId w:val="1"/>
+        </w:numPr>
+        <w:spacing w:after="80"/>
+      </w:pPr>
+      <w:r>
+        <w:t>As habilidades de classe (rascunho em revisão) e as classes novas, Clérigo e Mercenário</w:t>
+      </w:r>
+    </w:p>
+    <w:p>
+      <w:pPr>
+        <w:pStyle w:val="ListParagraph"/>
+        <w:numPr>
+          <w:ilvl w:val="0"/>
+          <w:numId w:val="1"/>
+        </w:numPr>
+        <w:spacing w:after="80"/>
+      </w:pPr>
+      <w:r>
+        <w:t>Ficha e limite das criaturas do Mestre de Forja</w:t>
       </w:r>
     </w:p>
     <w:sectPr>

</xml_diff>

<commit_message>
docx: Sábio, Saber e Poder
</commit_message>
<xml_diff>
--- a/sistema_vampiro_completo.docx
+++ b/sistema_vampiro_completo.docx
@@ -5532,7 +5532,7 @@
           <w:b/>
           <w:bCs/>
         </w:rPr>
-        <w:t xml:space="preserve">Ponto Fraco (Inicial, Ativa, Saber) | Custo: 10 Mana</w:t>
+        <w:t>Saber e Poder (Inicial, Passiva e Ativa, Saber) | Custo: 10 Mana no Efeito²</w:t>
       </w:r>
     </w:p>
     <w:p>
@@ -5544,7 +5544,7 @@
           <w:i/>
           <w:iCs/>
         </w:rPr>
-        <w:t xml:space="preserve">Todo monstro tem uma falha, e quase sempre alguém já a escreveu num livro.</w:t>
+        <w:t>Quem sabe mais aprende mais depressa, e quem aprende depressa passa a mandar no que sabe.</w:t>
       </w:r>
     </w:p>
     <w:p>
@@ -5559,7 +5559,7 @@
         <w:t xml:space="preserve">Efeito¹: </w:t>
       </w:r>
       <w:r>
-        <w:t xml:space="preserve">Gasta 10 de Mana e uma ação padrão estudando um alvo que consiga observar. Faz um teste de Ciências ou Investigação (DT 15).</w:t>
+        <w:t>Ganha o dobro de pontos de perícia por nível: +4 em vez de +2.</w:t>
       </w:r>
     </w:p>
     <w:p>
@@ -5574,7 +5574,7 @@
         <w:t xml:space="preserve">Efeito²: </w:t>
       </w:r>
       <w:r>
-        <w:t xml:space="preserve">Se passar, descobre uma fraqueza ou resistência do alvo (o mestre revela uma). O sábio e os aliados que o ouvirem têm vantagem no próximo ataque que explorar essa fraqueza.</w:t>
+        <w:t>Pode gastar 10 de Mana pra ganhar vantagem em testes de Razão.</w:t>
       </w:r>
     </w:p>
     <w:p>

</xml_diff>

<commit_message>
docx: perícia máximo 7, capítulo do bot sem comandos de mestre, rolagens, vantagem e habilidades criadas
</commit_message>
<xml_diff>
--- a/sistema_vampiro_completo.docx
+++ b/sistema_vampiro_completo.docx
@@ -90,6 +90,14 @@
       </w:pPr>
       <w:r>
         <w:t xml:space="preserve">Rolar mais de um dado numa mesma ação é raro. Só ocorre por meio de uma Disciplina, uma classe específica ou um item com essa propriedade explícita.</w:t>
+      </w:r>
+    </w:p>
+    <w:p>
+      <w:pPr>
+        <w:spacing w:after="150"/>
+      </w:pPr>
+      <w:r>
+        <w:t xml:space="preserve">Vantagem e desvantagem: com vantagem, o jogador rola dois d20 e fica com o maior. Com desvantagem, rola dois e fica com o menor.</w:t>
       </w:r>
     </w:p>
     <w:p>
@@ -840,7 +848,7 @@
         <w:spacing w:after="150"/>
       </w:pPr>
       <w:r>
-        <w:t xml:space="preserve">25 pontos para distribuir na criação, com máximo de 7 pontos em uma mesma perícia. O atributo somado no teste depende da ação e do contexto da cena, não é fixo por perícia.</w:t>
+        <w:t>25 pontos para distribuir na criação (o Mundano começa com 30). Cada nível dá +2 pontos de perícia, e o Sábio ganha +4. Nenhuma perícia passa de 7 pontos, em qualquer nível: nem com os pontos ganhos ao subir. O atributo somado no teste depende da ação e do contexto da cena, não é fixo por perícia.</w:t>
       </w:r>
     </w:p>
     <w:p>
@@ -3657,7 +3665,7 @@
         <w:spacing w:after="150"/>
       </w:pPr>
       <w:r>
-        <w:t xml:space="preserve">Rolado em 1d100 na criação, uma vez só por personagem.</w:t>
+        <w:t>Rolado em 1d100 na criação, com até 3 rolagens por personagem: vale a última, e o bot sempre pergunta antes de rolar de novo.</w:t>
       </w:r>
     </w:p>
     <w:tbl>
@@ -4201,7 +4209,7 @@
         <w:spacing w:after="150"/>
       </w:pPr>
       <w:r>
-        <w:t xml:space="preserve">Rolada em 1d100 na criação, uma vez só por personagem. Representa o Estado em que o personagem nasceu, entre os três estados da sociedade francesa da época. No bot, o /classe_social faz o sorteio e registra o Estado.</w:t>
+        <w:t>Rolada em 1d100 na criação, com até 3 rolagens por personagem: vale a última, e o bot sempre pergunta antes de rolar de novo. Representa o Estado em que o personagem nasceu, entre os três estados da sociedade francesa da época. No bot, o /classe_social faz o sorteio e registra o Estado.</w:t>
       </w:r>
     </w:p>
     <w:tbl>
@@ -5612,6 +5620,14 @@
       </w:pPr>
       <w:r>
         <w:t xml:space="preserve">Sem regra fixa de custo, tipo (ativa ou passiva) ou balanceamento. O jogador manda o rascunho pro mestre, que ajusta o que for preciso até ficar equilibrado. O foco do jogador deve ser a criatividade: a habilidade precisa representar o personagem e as capacidades que ele quer ter além de um humano ou vampiro comum.</w:t>
+      </w:r>
+    </w:p>
+    <w:p>
+      <w:pPr>
+        <w:spacing w:after="150"/>
+      </w:pPr>
+      <w:r>
+        <w:t xml:space="preserve">Além dessa, o jogador pode propor outras habilidades, até 8 por personagem (sem contar as recusadas). O mestre ajusta, aprova ou recusa, e define o custo (Mana, Estamina, Sanidade ou Vida) e o dado de dano ou cura, com um atributo somado se quiser. Quem aplica o dano ou a cura no alvo é o mestre.</w:t>
       </w:r>
     </w:p>
     <w:p>
@@ -6367,7 +6383,7 @@
         <w:spacing w:after="150"/>
       </w:pPr>
       <w:r>
-        <w:t xml:space="preserve">Somando tudo do nível 1 ao 10: 18 pontos de Perícia, 5 pontos de Atributo e 5 habilidades novas ou melhoradas (mais 5 pontos de Disciplina pra vampiros e dhampirs). A coluna “Pontos de Atributo no total” soma os 6 pontos da criação com os que vêm de nível, e é a conta que o bot usa pra conferir a distribuição. Depois do nível 10 o XP continua contando, mas não sobe mais nível.</w:t>
+        <w:t>Somando tudo do nível 1 ao 10: 18 pontos de Perícia (36 pro Sábio), 5 pontos de Atributo e 5 habilidades novas ou melhoradas (mais 5 pontos de Disciplina pra vampiros e dhampirs). A coluna “Pontos de Atributo no total” soma os 6 pontos da criação com os que vêm de nível, e é a conta que o bot usa pra conferir a distribuição. Depois do nível 10 o XP continua contando, mas não sobe mais nível.</w:t>
       </w:r>
     </w:p>
     <w:p>
@@ -6416,7 +6432,7 @@
         <w:spacing w:after="150"/>
       </w:pPr>
       <w:r>
-        <w:t xml:space="preserve">O bot do servidor rola dados, guarda o histórico e mantém a ficha automática de cada personagem.</w:t>
+        <w:t xml:space="preserve">O bot do servidor rola dados e mantém a ficha automática de cada personagem. O jogador faz quase tudo por botões.</w:t>
       </w:r>
     </w:p>
     <w:p>
@@ -6425,15 +6441,23 @@
         <w:spacing w:after="150" w:before="300"/>
       </w:pPr>
       <w:r>
-        <w:t xml:space="preserve">Pra começar</w:t>
-      </w:r>
-    </w:p>
-    <w:p>
-      <w:pPr>
-        <w:spacing w:after="150"/>
-      </w:pPr>
-      <w:r>
-        <w:t xml:space="preserve">Nessa ordem: /personagem criar, /magia_inicial, /raca_inicial, /classe_social, /classe, /atributos e /minha_ficha. Cada sorteio vale uma vez só por personagem, e o resultado aparece pra todo mundo. A classe também vale uma vez só. Se der erro, um mestre corrige.</w:t>
+        <w:t xml:space="preserve">Começar</w:t>
+      </w:r>
+    </w:p>
+    <w:p>
+      <w:pPr>
+        <w:spacing w:after="150"/>
+      </w:pPr>
+      <w:r>
+        <w:t xml:space="preserve">O mestre fixa uma mensagem de boas-vindas no canal. O jogador aperta 🆕 Criar personagem, diz o nome, e a ficha abre com botões na ordem certa: Raça, Classe social, Classe e Atributos. O 🔒 quer dizer que o passo ainda não abriu, e o ✅ que já foi feito.</w:t>
+      </w:r>
+    </w:p>
+    <w:p>
+      <w:pPr>
+        <w:spacing w:after="150"/>
+      </w:pPr>
+      <w:r>
+        <w:t xml:space="preserve">Raça e Classe social podem ser rolados até 3 vezes: vale a última, e o bot sempre pergunta antes de rolar de novo. O Rank de magia, pra quem tem magia inicial, vale uma vez só. Se der erro, um mestre corrige.</w:t>
       </w:r>
     </w:p>
     <w:p>
@@ -6442,15 +6466,90 @@
         <w:spacing w:after="150" w:before="300"/>
       </w:pPr>
       <w:r>
-        <w:t xml:space="preserve">Atributos no bot</w:t>
-      </w:r>
-    </w:p>
-    <w:p>
-      <w:pPr>
-        <w:spacing w:after="150"/>
-      </w:pPr>
-      <w:r>
-        <w:t>O jogador distribui os pontos com /atributos (só preenche o que quer mudar) e só pode aumentar; pra diminuir, precisa de um mestre. O bot confere duas coisas: o total de pontos (6 na criação mais 1 a cada 2 níveis) e os limites de criação da raça (Humano: 3 em Força, Destreza e Vitalidade e 6 em Razão; Vampiro: 5 em Força, Destreza e Vitalidade; Vontade e Alma sem limite). Só os pontos que vêm de nível podem passar dos limites de criação, como explica o capítulo Progressão de Personagem. Pro Dhampir, como os limites ainda não foram definidos, o bot só confere o total. O jogador precisa ter sorteado a raça antes. Os mestres podem definir atributos na mão, sem essas conferências. Os atributos de cada nível ficam guardados pra conta dos recursos (ver Recursos).</w:t>
+        <w:t xml:space="preserve">A ficha</w:t>
+      </w:r>
+    </w:p>
+    <w:p>
+      <w:pPr>
+        <w:spacing w:after="150"/>
+      </w:pPr>
+      <w:r>
+        <w:t xml:space="preserve">O /minha_ficha abre a ficha com 4 abas: Ficha, Vitais, Perícias e Habilidades. O /pericias e o /habilidades abrem direto nas duas últimas.</w:t>
+      </w:r>
+    </w:p>
+    <w:p>
+      <w:pPr>
+        <w:spacing w:after="120" w:before="100"/>
+      </w:pPr>
+      <w:r>
+        <w:rPr>
+          <w:b/>
+          <w:bCs/>
+        </w:rPr>
+        <w:t xml:space="preserve">Ficha. </w:t>
+      </w:r>
+      <w:r>
+        <w:t xml:space="preserve">Os passos da criação, as Disciplinas, os dados, os níveis, a ajuda e a troca de personagem.</w:t>
+      </w:r>
+    </w:p>
+    <w:p>
+      <w:pPr>
+        <w:spacing w:after="120" w:before="100"/>
+      </w:pPr>
+      <w:r>
+        <w:rPr>
+          <w:b/>
+          <w:bCs/>
+        </w:rPr>
+        <w:t xml:space="preserve">Vitais. </w:t>
+      </w:r>
+      <w:r>
+        <w:t xml:space="preserve">Barras de Vida, Sanidade, Mana e Estamina. Escolha a barra e use -10, -5, -1, +1, +5 e +10. “Valor exato” deixa digitar, e “Restaurar tudo” é o descanso. Precisa ter escolhido a classe.</w:t>
+      </w:r>
+    </w:p>
+    <w:p>
+      <w:pPr>
+        <w:spacing w:after="120" w:before="100"/>
+      </w:pPr>
+      <w:r>
+        <w:rPr>
+          <w:b/>
+          <w:bCs/>
+        </w:rPr>
+        <w:t xml:space="preserve">Perícias. </w:t>
+      </w:r>
+      <w:r>
+        <w:t xml:space="preserve">Cada perícia tem um ícone. Toque nele e o bot rola 1d20 + atributo + perícia sozinho, no nome do personagem. O atributo é o padrão de cada perícia (o botão Atributo deixa forçar outro), e o botão do modo troca entre normal, vantagem e desvantagem. A vantagem que a classe dá entra sozinha. O botão Distribuir abre a tela dos pontos (25 na criação, no máximo 7 em cada) e o menu onde Caçador e Mercenário escolhem Luta ou Pontaria e o Mundano escolhe duas.</w:t>
+      </w:r>
+    </w:p>
+    <w:p>
+      <w:pPr>
+        <w:spacing w:after="120" w:before="100"/>
+      </w:pPr>
+      <w:r>
+        <w:rPr>
+          <w:b/>
+          <w:bCs/>
+        </w:rPr>
+        <w:t xml:space="preserve">Habilidades. </w:t>
+      </w:r>
+      <w:r>
+        <w:t xml:space="preserve">“Criar habilidade” abre um formulário (nome, descrição e o que você quer que ela faça). O mestre ajusta e aprova, e define custo e dado. Na lista: ⏳ aguardando, 🔧 ajuste pedido (com nota), ✅ aprovada, ❌ recusada. Aprovada, “Usar” gasta o custo da barra e rola o dado no canal. Dá pra editar ou apagar as que ainda não foram aprovadas. No máximo 8 por personagem.</w:t>
+      </w:r>
+    </w:p>
+    <w:p>
+      <w:pPr>
+        <w:spacing w:after="120" w:before="100"/>
+      </w:pPr>
+      <w:r>
+        <w:rPr>
+          <w:b/>
+          <w:bCs/>
+        </w:rPr>
+        <w:t xml:space="preserve">Habilidade de classe. </w:t>
+      </w:r>
+      <w:r>
+        <w:t xml:space="preserve">A habilidade da sua classe fica no botão Habilidade de classe. Ela é outra coisa que a aba Habilidades, onde ficam as que você cria.</w:t>
       </w:r>
     </w:p>
     <w:p>
@@ -6459,6 +6558,23 @@
         <w:spacing w:after="150" w:before="300"/>
       </w:pPr>
       <w:r>
+        <w:t xml:space="preserve">Atributos no bot</w:t>
+      </w:r>
+    </w:p>
+    <w:p>
+      <w:pPr>
+        <w:spacing w:after="150"/>
+      </w:pPr>
+      <w:r>
+        <w:t xml:space="preserve">O jogador distribui os pontos pelo botão Atributos (ou pelo /atributos) e só pode aumentar; pra baixar, precisa de um mestre. O bot confere duas coisas: o total de pontos (6 na criação mais 1 a cada 2 níveis) e os limites de criação da raça (Humano: 3 em Força, Destreza e Vitalidade e 6 em Razão; Vampiro: 5 em Força, Destreza e Vitalidade; Vontade e Alma sem limite). Só os pontos que vêm de nível podem passar dos limites de criação, como explica o capítulo Progressão. Pro Dhampir, como os limites ainda não foram definidos, o bot só confere o total. O jogador precisa ter sorteado a raça antes. Os atributos de cada nível ficam guardados pra conta dos recursos (ver Recursos).</w:t>
+      </w:r>
+    </w:p>
+    <w:p>
+      <w:pPr>
+        <w:pStyle w:val="Heading2"/>
+        <w:spacing w:after="150" w:before="300"/>
+      </w:pPr>
+      <w:r>
         <w:t xml:space="preserve">Limite de personagens</w:t>
       </w:r>
     </w:p>
@@ -6467,7 +6583,7 @@
         <w:spacing w:after="150"/>
       </w:pPr>
       <w:r>
-        <w:t xml:space="preserve">Cada jogador pode ter até 3 personagens. Os mestres podem liberar vagas extras, na mão, até 10 no total. O jogador pode excluir um personagem quando quiser, mas a exclusão é permanente: a ficha, o XP e os ranks somem, a vaga é liberada e as rolagens antigas continuam no histórico.</w:t>
+        <w:t xml:space="preserve">Cada jogador pode ter até 3 personagens, e um mestre pode liberar vagas extras, até 10 no total. O jogador pode excluir um personagem quando quiser, mas a exclusão é permanente: a ficha, o XP e os ranks somem, a vaga é liberada e as rolagens antigas continuam no histórico.</w:t>
       </w:r>
     </w:p>
     <w:p>
@@ -6542,6 +6658,286 @@
               <w:spacing w:after="0"/>
             </w:pPr>
             <w:r>
+              <w:t xml:space="preserve">/personagem criar, usar, listar, excluir</w:t>
+            </w:r>
+          </w:p>
+        </w:tc>
+        <w:tc>
+          <w:tcPr>
+            <w:tcW w:w="6747" w:type="dxa"/>
+          </w:tcPr>
+          <w:p>
+            <w:pPr>
+              <w:spacing w:after="0"/>
+            </w:pPr>
+            <w:r>
+              <w:t xml:space="preserve">Cria, troca, lista e exclui personagens</w:t>
+            </w:r>
+          </w:p>
+        </w:tc>
+      </w:tr>
+      <w:tr>
+        <w:tc>
+          <w:tcPr>
+            <w:tcW w:w="2891" w:type="dxa"/>
+          </w:tcPr>
+          <w:p>
+            <w:pPr>
+              <w:spacing w:after="0"/>
+            </w:pPr>
+            <w:r>
+              <w:t xml:space="preserve">/raca_inicial</w:t>
+            </w:r>
+          </w:p>
+        </w:tc>
+        <w:tc>
+          <w:tcPr>
+            <w:tcW w:w="6747" w:type="dxa"/>
+          </w:tcPr>
+          <w:p>
+            <w:pPr>
+              <w:spacing w:after="0"/>
+            </w:pPr>
+            <w:r>
+              <w:t xml:space="preserve">Sorteia a Raça</w:t>
+            </w:r>
+          </w:p>
+        </w:tc>
+      </w:tr>
+      <w:tr>
+        <w:tc>
+          <w:tcPr>
+            <w:tcW w:w="2891" w:type="dxa"/>
+          </w:tcPr>
+          <w:p>
+            <w:pPr>
+              <w:spacing w:after="0"/>
+            </w:pPr>
+            <w:r>
+              <w:t xml:space="preserve">/classe_social</w:t>
+            </w:r>
+          </w:p>
+        </w:tc>
+        <w:tc>
+          <w:tcPr>
+            <w:tcW w:w="6747" w:type="dxa"/>
+          </w:tcPr>
+          <w:p>
+            <w:pPr>
+              <w:spacing w:after="0"/>
+            </w:pPr>
+            <w:r>
+              <w:t xml:space="preserve">Sorteia o Estado (e o Clero, se for 1º Estado)</w:t>
+            </w:r>
+          </w:p>
+        </w:tc>
+      </w:tr>
+      <w:tr>
+        <w:tc>
+          <w:tcPr>
+            <w:tcW w:w="2891" w:type="dxa"/>
+          </w:tcPr>
+          <w:p>
+            <w:pPr>
+              <w:spacing w:after="0"/>
+            </w:pPr>
+            <w:r>
+              <w:t xml:space="preserve">/classe</w:t>
+            </w:r>
+          </w:p>
+        </w:tc>
+        <w:tc>
+          <w:tcPr>
+            <w:tcW w:w="6747" w:type="dxa"/>
+          </w:tcPr>
+          <w:p>
+            <w:pPr>
+              <w:spacing w:after="0"/>
+            </w:pPr>
+            <w:r>
+              <w:t xml:space="preserve">Escolhe a classe do personagem</w:t>
+            </w:r>
+          </w:p>
+        </w:tc>
+      </w:tr>
+      <w:tr>
+        <w:tc>
+          <w:tcPr>
+            <w:tcW w:w="2891" w:type="dxa"/>
+          </w:tcPr>
+          <w:p>
+            <w:pPr>
+              <w:spacing w:after="0"/>
+            </w:pPr>
+            <w:r>
+              <w:t xml:space="preserve">/habilidade</w:t>
+            </w:r>
+          </w:p>
+        </w:tc>
+        <w:tc>
+          <w:tcPr>
+            <w:tcW w:w="6747" w:type="dxa"/>
+          </w:tcPr>
+          <w:p>
+            <w:pPr>
+              <w:spacing w:after="0"/>
+            </w:pPr>
+            <w:r>
+              <w:t xml:space="preserve">Mostra a habilidade da classe do personagem</w:t>
+            </w:r>
+          </w:p>
+        </w:tc>
+      </w:tr>
+      <w:tr>
+        <w:tc>
+          <w:tcPr>
+            <w:tcW w:w="2891" w:type="dxa"/>
+          </w:tcPr>
+          <w:p>
+            <w:pPr>
+              <w:spacing w:after="0"/>
+            </w:pPr>
+            <w:r>
+              <w:t xml:space="preserve">/magia_inicial</w:t>
+            </w:r>
+          </w:p>
+        </w:tc>
+        <w:tc>
+          <w:tcPr>
+            <w:tcW w:w="6747" w:type="dxa"/>
+          </w:tcPr>
+          <w:p>
+            <w:pPr>
+              <w:spacing w:after="0"/>
+            </w:pPr>
+            <w:r>
+              <w:t xml:space="preserve">Sorteia o Rank de magia (só pra quem tem magia inicial)</w:t>
+            </w:r>
+          </w:p>
+        </w:tc>
+      </w:tr>
+      <w:tr>
+        <w:tc>
+          <w:tcPr>
+            <w:tcW w:w="2891" w:type="dxa"/>
+          </w:tcPr>
+          <w:p>
+            <w:pPr>
+              <w:spacing w:after="0"/>
+            </w:pPr>
+            <w:r>
+              <w:t xml:space="preserve">/atributos</w:t>
+            </w:r>
+          </w:p>
+        </w:tc>
+        <w:tc>
+          <w:tcPr>
+            <w:tcW w:w="6747" w:type="dxa"/>
+          </w:tcPr>
+          <w:p>
+            <w:pPr>
+              <w:spacing w:after="0"/>
+            </w:pPr>
+            <w:r>
+              <w:t xml:space="preserve">Distribui os pontos de atributo (só dá pra aumentar)</w:t>
+            </w:r>
+          </w:p>
+        </w:tc>
+      </w:tr>
+      <w:tr>
+        <w:tc>
+          <w:tcPr>
+            <w:tcW w:w="2891" w:type="dxa"/>
+          </w:tcPr>
+          <w:p>
+            <w:pPr>
+              <w:spacing w:after="0"/>
+            </w:pPr>
+            <w:r>
+              <w:t xml:space="preserve">/minha_ficha</w:t>
+            </w:r>
+          </w:p>
+        </w:tc>
+        <w:tc>
+          <w:tcPr>
+            <w:tcW w:w="6747" w:type="dxa"/>
+          </w:tcPr>
+          <w:p>
+            <w:pPr>
+              <w:spacing w:after="0"/>
+            </w:pPr>
+            <w:r>
+              <w:t xml:space="preserve">Abre a ficha, com as abas Ficha, Vitais, Perícias e Habilidades</w:t>
+            </w:r>
+          </w:p>
+        </w:tc>
+      </w:tr>
+      <w:tr>
+        <w:tc>
+          <w:tcPr>
+            <w:tcW w:w="2891" w:type="dxa"/>
+          </w:tcPr>
+          <w:p>
+            <w:pPr>
+              <w:spacing w:after="0"/>
+            </w:pPr>
+            <w:r>
+              <w:t xml:space="preserve">/pericias</w:t>
+            </w:r>
+          </w:p>
+        </w:tc>
+        <w:tc>
+          <w:tcPr>
+            <w:tcW w:w="6747" w:type="dxa"/>
+          </w:tcPr>
+          <w:p>
+            <w:pPr>
+              <w:spacing w:after="0"/>
+            </w:pPr>
+            <w:r>
+              <w:t xml:space="preserve">Abre direto a aba Perícias</w:t>
+            </w:r>
+          </w:p>
+        </w:tc>
+      </w:tr>
+      <w:tr>
+        <w:tc>
+          <w:tcPr>
+            <w:tcW w:w="2891" w:type="dxa"/>
+          </w:tcPr>
+          <w:p>
+            <w:pPr>
+              <w:spacing w:after="0"/>
+            </w:pPr>
+            <w:r>
+              <w:t xml:space="preserve">/habilidades</w:t>
+            </w:r>
+          </w:p>
+        </w:tc>
+        <w:tc>
+          <w:tcPr>
+            <w:tcW w:w="6747" w:type="dxa"/>
+          </w:tcPr>
+          <w:p>
+            <w:pPr>
+              <w:spacing w:after="0"/>
+            </w:pPr>
+            <w:r>
+              <w:t xml:space="preserve">Abre direto a aba Habilidades</w:t>
+            </w:r>
+          </w:p>
+        </w:tc>
+      </w:tr>
+      <w:tr>
+        <w:tc>
+          <w:tcPr>
+            <w:tcW w:w="2891" w:type="dxa"/>
+          </w:tcPr>
+          <w:p>
+            <w:pPr>
+              <w:spacing w:after="0"/>
+            </w:pPr>
+            <w:r>
               <w:t xml:space="preserve">/rolar</w:t>
             </w:r>
           </w:p>
@@ -6555,7 +6951,7 @@
               <w:spacing w:after="0"/>
             </w:pPr>
             <w:r>
-              <w:t xml:space="preserve">Rola um dado (ex: 1d20+3) e guarda no histórico, com motivo opcional</w:t>
+              <w:t xml:space="preserve">Rola um dado (ex: 1d20+3, ou 3#d20+5 pra rolar três vezes, cada uma separada) e guarda no histórico, com motivo opcional</w:t>
             </w:r>
           </w:p>
         </w:tc>
@@ -6570,6 +6966,90 @@
               <w:spacing w:after="0"/>
             </w:pPr>
             <w:r>
+              <w:t xml:space="preserve">/dados</w:t>
+            </w:r>
+          </w:p>
+        </w:tc>
+        <w:tc>
+          <w:tcPr>
+            <w:tcW w:w="6747" w:type="dxa"/>
+          </w:tcPr>
+          <w:p>
+            <w:pPr>
+              <w:spacing w:after="0"/>
+            </w:pPr>
+            <w:r>
+              <w:t xml:space="preserve">Abre uma bandeja de botões de dados</w:t>
+            </w:r>
+          </w:p>
+        </w:tc>
+      </w:tr>
+      <w:tr>
+        <w:tc>
+          <w:tcPr>
+            <w:tcW w:w="2891" w:type="dxa"/>
+          </w:tcPr>
+          <w:p>
+            <w:pPr>
+              <w:spacing w:after="0"/>
+            </w:pPr>
+            <w:r>
+              <w:t xml:space="preserve">/iniciativa</w:t>
+            </w:r>
+          </w:p>
+        </w:tc>
+        <w:tc>
+          <w:tcPr>
+            <w:tcW w:w="6747" w:type="dxa"/>
+          </w:tcPr>
+          <w:p>
+            <w:pPr>
+              <w:spacing w:after="0"/>
+            </w:pPr>
+            <w:r>
+              <w:t xml:space="preserve">Rola a iniciativa do personagem na cena do canal</w:t>
+            </w:r>
+          </w:p>
+        </w:tc>
+      </w:tr>
+      <w:tr>
+        <w:tc>
+          <w:tcPr>
+            <w:tcW w:w="2891" w:type="dxa"/>
+          </w:tcPr>
+          <w:p>
+            <w:pPr>
+              <w:spacing w:after="0"/>
+            </w:pPr>
+            <w:r>
+              <w:t xml:space="preserve">/intencao</w:t>
+            </w:r>
+          </w:p>
+        </w:tc>
+        <w:tc>
+          <w:tcPr>
+            <w:tcW w:w="6747" w:type="dxa"/>
+          </w:tcPr>
+          <w:p>
+            <w:pPr>
+              <w:spacing w:after="0"/>
+            </w:pPr>
+            <w:r>
+              <w:t xml:space="preserve">Diz o que o personagem pretende fazer na cena</w:t>
+            </w:r>
+          </w:p>
+        </w:tc>
+      </w:tr>
+      <w:tr>
+        <w:tc>
+          <w:tcPr>
+            <w:tcW w:w="2891" w:type="dxa"/>
+          </w:tcPr>
+          <w:p>
+            <w:pPr>
+              <w:spacing w:after="0"/>
+            </w:pPr>
+            <w:r>
               <w:t xml:space="preserve">/historico</w:t>
             </w:r>
           </w:p>
@@ -6598,7 +7078,7 @@
               <w:spacing w:after="0"/>
             </w:pPr>
             <w:r>
-              <w:t xml:space="preserve">/personagem criar, usar, listar, excluir</w:t>
+              <w:t xml:space="preserve">/niveis</w:t>
             </w:r>
           </w:p>
         </w:tc>
@@ -6611,7 +7091,7 @@
               <w:spacing w:after="0"/>
             </w:pPr>
             <w:r>
-              <w:t xml:space="preserve">Cria, troca, lista e exclui personagens</w:t>
+              <w:t xml:space="preserve">Mostra o XP e as vantagens de cada nível e marca o nível do personagem</w:t>
             </w:r>
           </w:p>
         </w:tc>
@@ -6626,7 +7106,7 @@
               <w:spacing w:after="0"/>
             </w:pPr>
             <w:r>
-              <w:t xml:space="preserve">/magia_inicial</w:t>
+              <w:t xml:space="preserve">/extrato_xp</w:t>
             </w:r>
           </w:p>
         </w:tc>
@@ -6639,7 +7119,7 @@
               <w:spacing w:after="0"/>
             </w:pPr>
             <w:r>
-              <w:t xml:space="preserve">Sorteia o Rank de magia</w:t>
+              <w:t xml:space="preserve">Mostra de onde veio o XP do personagem, com motivo e mestre</w:t>
             </w:r>
           </w:p>
         </w:tc>
@@ -6654,7 +7134,7 @@
               <w:spacing w:after="0"/>
             </w:pPr>
             <w:r>
-              <w:t xml:space="preserve">/raca_inicial</w:t>
+              <w:t xml:space="preserve">/rank</w:t>
             </w:r>
           </w:p>
         </w:tc>
@@ -6667,7 +7147,7 @@
               <w:spacing w:after="0"/>
             </w:pPr>
             <w:r>
-              <w:t xml:space="preserve">Sorteia a Raça</w:t>
+              <w:t xml:space="preserve">Rank público de XP total, de personagens ou de jogadores (soma dos personagens de cada um)</w:t>
             </w:r>
           </w:p>
         </w:tc>
@@ -6682,7 +7162,7 @@
               <w:spacing w:after="0"/>
             </w:pPr>
             <w:r>
-              <w:t xml:space="preserve">/classe_social</w:t>
+              <w:t xml:space="preserve">/calcular_recursos</w:t>
             </w:r>
           </w:p>
         </w:tc>
@@ -6695,7 +7175,7 @@
               <w:spacing w:after="0"/>
             </w:pPr>
             <w:r>
-              <w:t xml:space="preserve">Sorteia o Estado (e o Clero, se for 1º Estado)</w:t>
+              <w:t xml:space="preserve">Simula Vida, Sanidade, Mana e Estamina com os números e o nível que o jogador digitar e mostra a conta</w:t>
             </w:r>
           </w:p>
         </w:tc>
@@ -6710,7 +7190,7 @@
               <w:spacing w:after="0"/>
             </w:pPr>
             <w:r>
-              <w:t xml:space="preserve">/classe</w:t>
+              <w:t xml:space="preserve">/disciplinas</w:t>
             </w:r>
           </w:p>
         </w:tc>
@@ -6723,7 +7203,7 @@
               <w:spacing w:after="0"/>
             </w:pPr>
             <w:r>
-              <w:t xml:space="preserve">Escolhe a classe do personagem (uma vez só)</w:t>
+              <w:t xml:space="preserve">Mostra as Disciplinas do personagem</w:t>
             </w:r>
           </w:p>
         </w:tc>
@@ -6738,7 +7218,7 @@
               <w:spacing w:after="0"/>
             </w:pPr>
             <w:r>
-              <w:t xml:space="preserve">/atributos</w:t>
+              <w:t xml:space="preserve">/ajuda, /help</w:t>
             </w:r>
           </w:p>
         </w:tc>
@@ -6751,147 +7231,7 @@
               <w:spacing w:after="0"/>
             </w:pPr>
             <w:r>
-              <w:t xml:space="preserve">Distribui os pontos de atributo (só dá pra aumentar)</w:t>
-            </w:r>
-          </w:p>
-        </w:tc>
-      </w:tr>
-      <w:tr>
-        <w:tc>
-          <w:tcPr>
-            <w:tcW w:w="2891" w:type="dxa"/>
-          </w:tcPr>
-          <w:p>
-            <w:pPr>
-              <w:spacing w:after="0"/>
-            </w:pPr>
-            <w:r>
-              <w:t xml:space="preserve">/minha_ficha</w:t>
-            </w:r>
-          </w:p>
-        </w:tc>
-        <w:tc>
-          <w:tcPr>
-            <w:tcW w:w="6747" w:type="dxa"/>
-          </w:tcPr>
-          <w:p>
-            <w:pPr>
-              <w:spacing w:after="0"/>
-            </w:pPr>
-            <w:r>
-              <w:t xml:space="preserve">Mostra nível, XP, Raça, Classe social, Rank de magia, Classe, Atributos, Vida, Sanidade, Mana, Estamina e Ranks das perícias especiais</w:t>
-            </w:r>
-          </w:p>
-        </w:tc>
-      </w:tr>
-      <w:tr>
-        <w:tc>
-          <w:tcPr>
-            <w:tcW w:w="2891" w:type="dxa"/>
-          </w:tcPr>
-          <w:p>
-            <w:pPr>
-              <w:spacing w:after="0"/>
-            </w:pPr>
-            <w:r>
-              <w:t xml:space="preserve">/niveis</w:t>
-            </w:r>
-          </w:p>
-        </w:tc>
-        <w:tc>
-          <w:tcPr>
-            <w:tcW w:w="6747" w:type="dxa"/>
-          </w:tcPr>
-          <w:p>
-            <w:pPr>
-              <w:spacing w:after="0"/>
-            </w:pPr>
-            <w:r>
-              <w:t xml:space="preserve">Mostra o XP e as vantagens de cada nível e marca o nível do personagem</w:t>
-            </w:r>
-          </w:p>
-        </w:tc>
-      </w:tr>
-      <w:tr>
-        <w:tc>
-          <w:tcPr>
-            <w:tcW w:w="2891" w:type="dxa"/>
-          </w:tcPr>
-          <w:p>
-            <w:pPr>
-              <w:spacing w:after="0"/>
-            </w:pPr>
-            <w:r>
-              <w:t xml:space="preserve">/extrato_xp</w:t>
-            </w:r>
-          </w:p>
-        </w:tc>
-        <w:tc>
-          <w:tcPr>
-            <w:tcW w:w="6747" w:type="dxa"/>
-          </w:tcPr>
-          <w:p>
-            <w:pPr>
-              <w:spacing w:after="0"/>
-            </w:pPr>
-            <w:r>
-              <w:t xml:space="preserve">Mostra de onde veio o XP do personagem, com motivo e mestre</w:t>
-            </w:r>
-          </w:p>
-        </w:tc>
-      </w:tr>
-      <w:tr>
-        <w:tc>
-          <w:tcPr>
-            <w:tcW w:w="2891" w:type="dxa"/>
-          </w:tcPr>
-          <w:p>
-            <w:pPr>
-              <w:spacing w:after="0"/>
-            </w:pPr>
-            <w:r>
-              <w:t xml:space="preserve">/rank</w:t>
-            </w:r>
-          </w:p>
-        </w:tc>
-        <w:tc>
-          <w:tcPr>
-            <w:tcW w:w="6747" w:type="dxa"/>
-          </w:tcPr>
-          <w:p>
-            <w:pPr>
-              <w:spacing w:after="0"/>
-            </w:pPr>
-            <w:r>
-              <w:t xml:space="preserve">Rank público de XP total, de personagens ou de jogadores (soma dos personagens de cada um)</w:t>
-            </w:r>
-          </w:p>
-        </w:tc>
-      </w:tr>
-      <w:tr>
-        <w:tc>
-          <w:tcPr>
-            <w:tcW w:w="2891" w:type="dxa"/>
-          </w:tcPr>
-          <w:p>
-            <w:pPr>
-              <w:spacing w:after="0"/>
-            </w:pPr>
-            <w:r>
-              <w:t xml:space="preserve">/calcular_recursos</w:t>
-            </w:r>
-          </w:p>
-        </w:tc>
-        <w:tc>
-          <w:tcPr>
-            <w:tcW w:w="6747" w:type="dxa"/>
-          </w:tcPr>
-          <w:p>
-            <w:pPr>
-              <w:spacing w:after="0"/>
-            </w:pPr>
-            <w:r>
-              <w:t>Simula Vida, Sanidade, Mana e Estamina com os números e o nível que o jogador digitar e mostra a conta</w:t>
+              <w:t xml:space="preserve">Mostra a ajuda do bot</w:t>
             </w:r>
           </w:p>
         </w:tc>
@@ -6907,445 +7247,18 @@
     </w:p>
     <w:p>
       <w:pPr>
-        <w:pStyle w:val="Heading2"/>
-        <w:spacing w:after="150" w:before="300"/>
-      </w:pPr>
-      <w:r>
-        <w:t xml:space="preserve">Comandos dos mestres</w:t>
-      </w:r>
-    </w:p>
-    <w:p>
-      <w:pPr>
-        <w:spacing w:after="150"/>
-      </w:pPr>
-      <w:r>
-        <w:t xml:space="preserve">Cargo Mestre ou permissão de Gerenciar Servidor.</w:t>
-      </w:r>
-    </w:p>
-    <w:tbl>
-      <w:tblPr>
-        <w:tblW w:w="9638" w:type="dxa"/>
-        <w:tblBorders>
-          <w:top w:val="single" w:sz="4" w:space="0" w:color="auto"/>
-          <w:left w:val="single" w:sz="4" w:space="0" w:color="auto"/>
-          <w:bottom w:val="single" w:sz="4" w:space="0" w:color="auto"/>
-          <w:right w:val="single" w:sz="4" w:space="0" w:color="auto"/>
-          <w:insideH w:val="single" w:sz="4" w:space="0" w:color="auto"/>
-          <w:insideV w:val="single" w:sz="4" w:space="0" w:color="auto"/>
-        </w:tblBorders>
-        <w:tblLayout w:type="fixed"/>
-      </w:tblPr>
-      <w:tblGrid>
-        <w:gridCol w:w="2891"/>
-        <w:gridCol w:w="6747"/>
-      </w:tblGrid>
-      <w:tr>
-        <w:tc>
-          <w:tcPr>
-            <w:tcW w:w="2891" w:type="dxa"/>
-          </w:tcPr>
-          <w:p>
-            <w:pPr>
-              <w:spacing w:after="0"/>
-            </w:pPr>
-            <w:r>
-              <w:rPr>
-                <w:b/>
-                <w:bCs/>
-              </w:rPr>
-              <w:t xml:space="preserve">Comando</w:t>
-            </w:r>
-          </w:p>
-        </w:tc>
-        <w:tc>
-          <w:tcPr>
-            <w:tcW w:w="6747" w:type="dxa"/>
-          </w:tcPr>
-          <w:p>
-            <w:pPr>
-              <w:spacing w:after="0"/>
-            </w:pPr>
-            <w:r>
-              <w:rPr>
-                <w:b/>
-                <w:bCs/>
-              </w:rPr>
-              <w:t xml:space="preserve">O que faz</w:t>
-            </w:r>
-          </w:p>
-        </w:tc>
-      </w:tr>
-      <w:tr>
-        <w:tc>
-          <w:tcPr>
-            <w:tcW w:w="2891" w:type="dxa"/>
-          </w:tcPr>
-          <w:p>
-            <w:pPr>
-              <w:spacing w:after="0"/>
-            </w:pPr>
-            <w:r>
-              <w:t xml:space="preserve">/mestre dar_xp</w:t>
-            </w:r>
-          </w:p>
-        </w:tc>
-        <w:tc>
-          <w:tcPr>
-            <w:tcW w:w="6747" w:type="dxa"/>
-          </w:tcPr>
-          <w:p>
-            <w:pPr>
-              <w:spacing w:after="0"/>
-            </w:pPr>
-            <w:r>
-              <w:t xml:space="preserve">Dá XP a um personagem; o nível sobe sozinho. Número negativo tira XP, pra corrigir um engano</w:t>
-            </w:r>
-          </w:p>
-        </w:tc>
-      </w:tr>
-      <w:tr>
-        <w:tc>
-          <w:tcPr>
-            <w:tcW w:w="2891" w:type="dxa"/>
-          </w:tcPr>
-          <w:p>
-            <w:pPr>
-              <w:spacing w:after="0"/>
-            </w:pPr>
-            <w:r>
-              <w:t xml:space="preserve">/mestre upar</w:t>
-            </w:r>
-          </w:p>
-        </w:tc>
-        <w:tc>
-          <w:tcPr>
-            <w:tcW w:w="6747" w:type="dxa"/>
-          </w:tcPr>
-          <w:p>
-            <w:pPr>
-              <w:spacing w:after="0"/>
-            </w:pPr>
-            <w:r>
-              <w:t xml:space="preserve">Atalho: dá o XP que falta pro próximo nível</w:t>
-            </w:r>
-          </w:p>
-        </w:tc>
-      </w:tr>
-      <w:tr>
-        <w:tc>
-          <w:tcPr>
-            <w:tcW w:w="2891" w:type="dxa"/>
-          </w:tcPr>
-          <w:p>
-            <w:pPr>
-              <w:spacing w:after="0"/>
-            </w:pPr>
-            <w:r>
-              <w:t xml:space="preserve">/mestre corrigir_nivel</w:t>
-            </w:r>
-          </w:p>
-        </w:tc>
-        <w:tc>
-          <w:tcPr>
-            <w:tcW w:w="6747" w:type="dxa"/>
-          </w:tcPr>
-          <w:p>
-            <w:pPr>
-              <w:spacing w:after="0"/>
-            </w:pPr>
-            <w:r>
-              <w:t xml:space="preserve">Põe o personagem no começo de um nível</w:t>
-            </w:r>
-          </w:p>
-        </w:tc>
-      </w:tr>
-      <w:tr>
-        <w:tc>
-          <w:tcPr>
-            <w:tcW w:w="2891" w:type="dxa"/>
-          </w:tcPr>
-          <w:p>
-            <w:pPr>
-              <w:spacing w:after="0"/>
-            </w:pPr>
-            <w:r>
-              <w:t xml:space="preserve">/mestre rank_pericia</w:t>
-            </w:r>
-          </w:p>
-        </w:tc>
-        <w:tc>
-          <w:tcPr>
-            <w:tcW w:w="6747" w:type="dxa"/>
-          </w:tcPr>
-          <w:p>
-            <w:pPr>
-              <w:spacing w:after="0"/>
-            </w:pPr>
-            <w:r>
-              <w:t xml:space="preserve">Define o Rank (0 a 10) de uma perícia especial</w:t>
-            </w:r>
-          </w:p>
-        </w:tc>
-      </w:tr>
-      <w:tr>
-        <w:tc>
-          <w:tcPr>
-            <w:tcW w:w="2891" w:type="dxa"/>
-          </w:tcPr>
-          <w:p>
-            <w:pPr>
-              <w:spacing w:after="0"/>
-            </w:pPr>
-            <w:r>
-              <w:t xml:space="preserve">/mestre apagar</w:t>
-            </w:r>
-          </w:p>
-        </w:tc>
-        <w:tc>
-          <w:tcPr>
-            <w:tcW w:w="6747" w:type="dxa"/>
-          </w:tcPr>
-          <w:p>
-            <w:pPr>
-              <w:spacing w:after="0"/>
-            </w:pPr>
-            <w:r>
-              <w:t xml:space="preserve">Apaga Rank de magia, Raça, Classe social ou tudo, pro jogador rolar de novo</w:t>
-            </w:r>
-          </w:p>
-        </w:tc>
-      </w:tr>
-      <w:tr>
-        <w:tc>
-          <w:tcPr>
-            <w:tcW w:w="2891" w:type="dxa"/>
-          </w:tcPr>
-          <w:p>
-            <w:pPr>
-              <w:spacing w:after="0"/>
-            </w:pPr>
-            <w:r>
-              <w:t xml:space="preserve">/mestre corrigir_magia, corrigir_raca, corrigir_estado</w:t>
-            </w:r>
-          </w:p>
-        </w:tc>
-        <w:tc>
-          <w:tcPr>
-            <w:tcW w:w="6747" w:type="dxa"/>
-          </w:tcPr>
-          <w:p>
-            <w:pPr>
-              <w:spacing w:after="0"/>
-            </w:pPr>
-            <w:r>
-              <w:t xml:space="preserve">Define o valor na mão, sem rolar</w:t>
-            </w:r>
-          </w:p>
-        </w:tc>
-      </w:tr>
-      <w:tr>
-        <w:tc>
-          <w:tcPr>
-            <w:tcW w:w="2891" w:type="dxa"/>
-          </w:tcPr>
-          <w:p>
-            <w:pPr>
-              <w:spacing w:after="0"/>
-            </w:pPr>
-            <w:r>
-              <w:t xml:space="preserve">/mestre ficha</w:t>
-            </w:r>
-          </w:p>
-        </w:tc>
-        <w:tc>
-          <w:tcPr>
-            <w:tcW w:w="6747" w:type="dxa"/>
-          </w:tcPr>
-          <w:p>
-            <w:pPr>
-              <w:spacing w:after="0"/>
-            </w:pPr>
-            <w:r>
-              <w:t xml:space="preserve">Mostra a ficha completa de um personagem</w:t>
-            </w:r>
-          </w:p>
-        </w:tc>
-      </w:tr>
-      <w:tr>
-        <w:tc>
-          <w:tcPr>
-            <w:tcW w:w="2891" w:type="dxa"/>
-          </w:tcPr>
-          <w:p>
-            <w:pPr>
-              <w:spacing w:after="0"/>
-            </w:pPr>
-            <w:r>
-              <w:t xml:space="preserve">/mestre jogador</w:t>
-            </w:r>
-          </w:p>
-        </w:tc>
-        <w:tc>
-          <w:tcPr>
-            <w:tcW w:w="6747" w:type="dxa"/>
-          </w:tcPr>
-          <w:p>
-            <w:pPr>
-              <w:spacing w:after="0"/>
-            </w:pPr>
-            <w:r>
-              <w:t xml:space="preserve">Mostra quantos personagens o jogador tem, as vagas, o XP de cada um e quantos já excluiu</w:t>
-            </w:r>
-          </w:p>
-        </w:tc>
-      </w:tr>
-      <w:tr>
-        <w:tc>
-          <w:tcPr>
-            <w:tcW w:w="2891" w:type="dxa"/>
-          </w:tcPr>
-          <w:p>
-            <w:pPr>
-              <w:spacing w:after="0"/>
-            </w:pPr>
-            <w:r>
-              <w:t xml:space="preserve">/mestre vagas</w:t>
-            </w:r>
-          </w:p>
-        </w:tc>
-        <w:tc>
-          <w:tcPr>
-            <w:tcW w:w="6747" w:type="dxa"/>
-          </w:tcPr>
-          <w:p>
-            <w:pPr>
-              <w:spacing w:after="0"/>
-            </w:pPr>
-            <w:r>
-              <w:t xml:space="preserve">Define as vagas extras de personagem de um jogador</w:t>
-            </w:r>
-          </w:p>
-        </w:tc>
-      </w:tr>
-      <w:tr>
-        <w:tc>
-          <w:tcPr>
-            <w:tcW w:w="2891" w:type="dxa"/>
-          </w:tcPr>
-          <w:p>
-            <w:pPr>
-              <w:spacing w:after="0"/>
-            </w:pPr>
-            <w:r>
-              <w:t xml:space="preserve">/mestre excluir_personagem</w:t>
-            </w:r>
-          </w:p>
-        </w:tc>
-        <w:tc>
-          <w:tcPr>
-            <w:tcW w:w="6747" w:type="dxa"/>
-          </w:tcPr>
-          <w:p>
-            <w:pPr>
-              <w:spacing w:after="0"/>
-            </w:pPr>
-            <w:r>
-              <w:t xml:space="preserve">Exclui pra sempre o personagem de outro jogador (pede confirmação e avisa o jogador)</w:t>
-            </w:r>
-          </w:p>
-        </w:tc>
-      </w:tr>
-      <w:tr>
-        <w:tc>
-          <w:tcPr>
-            <w:tcW w:w="2891" w:type="dxa"/>
-          </w:tcPr>
-          <w:p>
-            <w:pPr>
-              <w:spacing w:after="0"/>
-            </w:pPr>
-            <w:r>
-              <w:t xml:space="preserve">/mestre atributos</w:t>
-            </w:r>
-          </w:p>
-        </w:tc>
-        <w:tc>
-          <w:tcPr>
-            <w:tcW w:w="6747" w:type="dxa"/>
-          </w:tcPr>
-          <w:p>
-            <w:pPr>
-              <w:spacing w:after="0"/>
-            </w:pPr>
-            <w:r>
-              <w:t xml:space="preserve">Define atributos na mão, sem conferir pontos nem limites (pode diminuir)</w:t>
-            </w:r>
-          </w:p>
-        </w:tc>
-      </w:tr>
-      <w:tr>
-        <w:tc>
-          <w:tcPr>
-            <w:tcW w:w="2891" w:type="dxa"/>
-          </w:tcPr>
-          <w:p>
-            <w:pPr>
-              <w:spacing w:after="0"/>
-            </w:pPr>
-            <w:r>
-              <w:t xml:space="preserve">/mestre corrigir_classe</w:t>
-            </w:r>
-          </w:p>
-        </w:tc>
-        <w:tc>
-          <w:tcPr>
-            <w:tcW w:w="6747" w:type="dxa"/>
-          </w:tcPr>
-          <w:p>
-            <w:pPr>
-              <w:spacing w:after="0"/>
-            </w:pPr>
-            <w:r>
-              <w:t xml:space="preserve">Define a classe na mão, mesmo depois de o jogador já ter escolhido</w:t>
-            </w:r>
-          </w:p>
-        </w:tc>
-      </w:tr>
-      <w:tr>
-        <w:tc>
-          <w:tcPr>
-            <w:tcW w:w="2891" w:type="dxa"/>
-          </w:tcPr>
-          <w:p>
-            <w:pPr>
-              <w:spacing w:after="0"/>
-            </w:pPr>
-            <w:r>
-              <w:t xml:space="preserve">/mestre exportar</w:t>
-            </w:r>
-          </w:p>
-        </w:tc>
-        <w:tc>
-          <w:tcPr>
-            <w:tcW w:w="6747" w:type="dxa"/>
-          </w:tcPr>
-          <w:p>
-            <w:pPr>
-              <w:spacing w:after="0"/>
-            </w:pPr>
-            <w:r>
-              <w:t xml:space="preserve">Manda ao mestre uma cópia de segurança do banco de dados (só ele vê)</w:t>
-            </w:r>
-          </w:p>
-        </w:tc>
-      </w:tr>
-    </w:tbl>
-    <w:p>
-      <w:pPr>
-        <w:spacing w:after="150" w:before="120"/>
-      </w:pPr>
-      <w:r>
-        <w:t xml:space="preserve">Toda rolagem e toda ação de mestre ficam registradas.</w:t>
+        <w:spacing w:after="150"/>
+      </w:pPr>
+      <w:r>
+        <w:t xml:space="preserve">Quem é mestre tem comandos próprios, com ajuda separada dentro do bot.</w:t>
+      </w:r>
+    </w:p>
+    <w:p>
+      <w:pPr>
+        <w:spacing w:after="150"/>
+      </w:pPr>
+      <w:r>
+        <w:t xml:space="preserve">Toda rolagem fica registrada no histórico.</w:t>
       </w:r>
     </w:p>
     <w:p>

</xml_diff>